<commit_message>
docs: expand content checklist into a per-item tracker
Break each content row into named line items (5 projects, 6 centers, 5
datasets — pulled from the live CMS) with Owner / Target / Done columns so
management can assign and track. Adds a consolidated list of the one-time
CMS setups for the dev team. Rebuilt docx (tables + checkboxes, field-code-
free). Still a dated snapshot of the roadmap's content items.
</commit_message>
<xml_diff>
--- a/docs/ICJIA-Research-Hub-content-checklist.docx
+++ b/docs/ICJIA-Research-Hub-content-checklist.docx
@@ -15,7 +15,7 @@
         <w:pStyle w:val="Subtitle"/>
       </w:pPr>
       <w:r>
-        <w:t xml:space="preserve">The content still to be added in the CMS before the new Research Hub goes public</w:t>
+        <w:t xml:space="preserve">Item-by-item tracker of the content to add in the CMS before the new Research Hub goes public</w:t>
       </w:r>
     </w:p>
     <w:p>
@@ -56,13 +56,13 @@
         <w:t xml:space="preserve"> </w:t>
       </w:r>
       <w:r>
-        <w:t xml:space="preserve">at the private preview address. The</w:t>
-      </w:r>
-      <w:r>
-        <w:t xml:space="preserve"> </w:t>
-      </w:r>
-      <w:r>
-        <w:t xml:space="preserve">engineering is built and continuously tested; what remains before it can go public is mostly</w:t>
+        <w:t xml:space="preserve">at the private preview address. The engineering</w:t>
+      </w:r>
+      <w:r>
+        <w:t xml:space="preserve"> </w:t>
+      </w:r>
+      <w:r>
+        <w:t xml:space="preserve">is built and continuously tested; what remains before it can go public is mostly</w:t>
       </w:r>
       <w:r>
         <w:t xml:space="preserve"> </w:t>
@@ -78,13 +78,13 @@
         <w:t xml:space="preserve"> </w:t>
       </w:r>
       <w:r>
-        <w:t xml:space="preserve">— things that need to be written or uploaded in the content system (Strapi) — plus the</w:t>
-      </w:r>
-      <w:r>
-        <w:t xml:space="preserve"> </w:t>
-      </w:r>
-      <w:r>
-        <w:t xml:space="preserve">go-live coordination handled separately.</w:t>
+        <w:t xml:space="preserve">to be</w:t>
+      </w:r>
+      <w:r>
+        <w:t xml:space="preserve"> </w:t>
+      </w:r>
+      <w:r>
+        <w:t xml:space="preserve">written or uploaded in the content system (Strapi), plus the go-live coordination handled separately.</w:t>
       </w:r>
     </w:p>
     <w:p>
@@ -92,7 +92,61 @@
         <w:pStyle w:val="BodyText"/>
       </w:pPr>
       <w:r>
-        <w:t xml:space="preserve">This is a plain-language checklist of that remaining content, for planning and assignment.</w:t>
+        <w:t xml:space="preserve">This is an item-by-item tracker of that content — every project, center, and dataset listed by name —</w:t>
+      </w:r>
+      <w:r>
+        <w:t xml:space="preserve"> </w:t>
+      </w:r>
+      <w:r>
+        <w:t xml:space="preserve">so the work can be assigned and tracked. Fill in</w:t>
+      </w:r>
+      <w:r>
+        <w:t xml:space="preserve"> </w:t>
+      </w:r>
+      <w:r>
+        <w:rPr>
+          <w:b/>
+          <w:bCs/>
+        </w:rPr>
+        <w:t xml:space="preserve">Owner</w:t>
+      </w:r>
+      <w:r>
+        <w:t xml:space="preserve"> </w:t>
+      </w:r>
+      <w:r>
+        <w:t xml:space="preserve">and</w:t>
+      </w:r>
+      <w:r>
+        <w:t xml:space="preserve"> </w:t>
+      </w:r>
+      <w:r>
+        <w:rPr>
+          <w:b/>
+          <w:bCs/>
+        </w:rPr>
+        <w:t xml:space="preserve">Target</w:t>
+      </w:r>
+      <w:r>
+        <w:t xml:space="preserve"> </w:t>
+      </w:r>
+      <w:r>
+        <w:t xml:space="preserve">as you go, and mark</w:t>
+      </w:r>
+      <w:r>
+        <w:t xml:space="preserve"> </w:t>
+      </w:r>
+      <w:r>
+        <w:rPr>
+          <w:b/>
+          <w:bCs/>
+        </w:rPr>
+        <w:t xml:space="preserve">Done</w:t>
+      </w:r>
+      <w:r>
+        <w:t xml:space="preserve"> </w:t>
+      </w:r>
+      <w:r>
+        <w:t xml:space="preserve">(change ☐ to ☒) when each item is complete.</w:t>
       </w:r>
     </w:p>
     <w:p>
@@ -120,13 +174,13 @@
           <w:b/>
           <w:bCs/>
         </w:rPr>
-        <w:t xml:space="preserve">2 items</w:t>
-      </w:r>
-      <w:r>
-        <w:t xml:space="preserve"> </w:t>
-      </w:r>
-      <w:r>
-        <w:t xml:space="preserve">can be written today, no technical work needed.</w:t>
+        <w:t xml:space="preserve">Write now (no technical work):</w:t>
+      </w:r>
+      <w:r>
+        <w:t xml:space="preserve"> </w:t>
+      </w:r>
+      <w:r>
+        <w:t xml:space="preserve">the homepage (3 pieces) and the 5 project write-ups.</w:t>
       </w:r>
     </w:p>
     <w:p>
@@ -142,19 +196,37 @@
           <w:b/>
           <w:bCs/>
         </w:rPr>
-        <w:t xml:space="preserve">5 items</w:t>
-      </w:r>
-      <w:r>
-        <w:t xml:space="preserve"> </w:t>
-      </w:r>
-      <w:r>
-        <w:t xml:space="preserve">need a small one-time change to the content system first (a new field or link), then</w:t>
-      </w:r>
-      <w:r>
-        <w:t xml:space="preserve"> </w:t>
-      </w:r>
-      <w:r>
-        <w:t xml:space="preserve">content entry.</w:t>
+        <w:t xml:space="preserve">Needs a one-time system change first, then content:</w:t>
+      </w:r>
+      <w:r>
+        <w:t xml:space="preserve"> </w:t>
+      </w:r>
+      <w:r>
+        <w:t xml:space="preserve">photos for 6 centers, thumbnails for 5</w:t>
+      </w:r>
+      <w:r>
+        <w:t xml:space="preserve"> </w:t>
+      </w:r>
+      <w:r>
+        <w:t xml:space="preserve">datasets,</w:t>
+      </w:r>
+      <w:r>
+        <w:t xml:space="preserve"> </w:t>
+      </w:r>
+      <w:r>
+        <w:t xml:space="preserve">“filter articles by center”</w:t>
+      </w:r>
+      <w:r>
+        <w:t xml:space="preserve"> </w:t>
+      </w:r>
+      <w:r>
+        <w:t xml:space="preserve">(setup + tagging ~236 articles), related content on the 5</w:t>
+      </w:r>
+      <w:r>
+        <w:t xml:space="preserve"> </w:t>
+      </w:r>
+      <w:r>
+        <w:t xml:space="preserve">project pages, and an optional article-links field.</w:t>
       </w:r>
     </w:p>
     <w:p>
@@ -170,13 +242,13 @@
           <w:b/>
           <w:bCs/>
         </w:rPr>
-        <w:t xml:space="preserve">1 item</w:t>
-      </w:r>
-      <w:r>
-        <w:t xml:space="preserve"> </w:t>
-      </w:r>
-      <w:r>
-        <w:t xml:space="preserve">is a content sync at go-live.</w:t>
+        <w:t xml:space="preserve">At go-live:</w:t>
+      </w:r>
+      <w:r>
+        <w:t xml:space="preserve"> </w:t>
+      </w:r>
+      <w:r>
+        <w:t xml:space="preserve">one content sync.</w:t>
       </w:r>
     </w:p>
     <w:p>
@@ -184,7 +256,7 @@
         <w:pStyle w:val="FirstParagraph"/>
       </w:pPr>
       <w:r>
-        <w:t xml:space="preserve">This is a snapshot for hand-off. The live, always-current version of this list lives on the project</w:t>
+        <w:t xml:space="preserve">This is a snapshot for hand-off; the always-current version is the project</w:t>
       </w:r>
       <w:r>
         <w:t xml:space="preserve"> </w:t>
@@ -200,7 +272,13 @@
         <w:t xml:space="preserve"> </w:t>
       </w:r>
       <w:r>
-        <w:t xml:space="preserve">(in the app under</w:t>
+        <w:t xml:space="preserve">(in the app</w:t>
+      </w:r>
+      <w:r>
+        <w:t xml:space="preserve"> </w:t>
+      </w:r>
+      <w:r>
+        <w:t xml:space="preserve">under</w:t>
       </w:r>
       <w:r>
         <w:t xml:space="preserve"> </w:t>
@@ -221,207 +299,61 @@
         <w:t xml:space="preserve">ROADMAP.md</w:t>
       </w:r>
       <w:r>
-        <w:t xml:space="preserve">), which is</w:t>
-      </w:r>
-      <w:r>
-        <w:t xml:space="preserve"> </w:t>
-      </w:r>
-      <w:r>
-        <w:t xml:space="preserve">updated as each item is completed.</w:t>
+        <w:t xml:space="preserve">).</w:t>
       </w:r>
     </w:p>
     <w:p>
-      <w:r>
-        <w:pict>
-          <v:rect style="width:0;height:1.5pt" o:hralign="center" o:hrstd="t" o:hr="t"/>
-        </w:pict>
-      </w:r>
-    </w:p>
-    <w:bookmarkEnd w:id="9"/>
-    <w:bookmarkStart w:id="10" w:name="X0b81692463ed81ba9fbf77b56452c3258c8f1bf"/>
-    <w:p>
-      <w:pPr>
-        <w:pStyle w:val="Heading2"/>
-      </w:pPr>
-      <w:r>
-        <w:t xml:space="preserve">1. Ready to write now — no technical work needed</w:t>
-      </w:r>
-    </w:p>
-    <w:p>
-      <w:pPr>
-        <w:pStyle w:val="FirstParagraph"/>
-      </w:pPr>
-      <w:r>
-        <w:t xml:space="preserve">A content editor can do these in the CMS today.</w:t>
-      </w:r>
-    </w:p>
-    <w:p>
-      <w:pPr>
-        <w:pStyle w:val="Compact"/>
-        <w:numPr>
-          <w:ilvl w:val="0"/>
-          <w:numId w:val="1002"/>
-        </w:numPr>
+      <w:pPr>
+        <w:pStyle w:val="BlockText"/>
       </w:pPr>
       <w:r>
         <w:rPr>
           <w:b/>
           <w:bCs/>
         </w:rPr>
-        <w:t xml:space="preserve">Homepage content</w:t>
-      </w:r>
-      <w:r>
-        <w:t xml:space="preserve"> </w:t>
-      </w:r>
-      <w:r>
-        <w:t xml:space="preserve">— author the</w:t>
-      </w:r>
-      <w:r>
-        <w:t xml:space="preserve"> </w:t>
-      </w:r>
-      <w:r>
-        <w:t xml:space="preserve">“Hub Home”</w:t>
-      </w:r>
-      <w:r>
-        <w:t xml:space="preserve"> </w:t>
-      </w:r>
-      <w:r>
-        <w:t xml:space="preserve">entry.</w:t>
-      </w:r>
-    </w:p>
-    <w:p>
-      <w:pPr>
-        <w:pStyle w:val="Compact"/>
-        <w:numPr>
-          <w:ilvl w:val="1"/>
-          <w:numId w:val="1003"/>
-        </w:numPr>
-      </w:pPr>
-      <w:r>
-        <w:t xml:space="preserve">Adds the homepage</w:t>
-      </w:r>
-      <w:r>
-        <w:t xml:space="preserve"> </w:t>
-      </w:r>
-      <w:r>
-        <w:rPr>
-          <w:b/>
-          <w:bCs/>
-        </w:rPr>
-        <w:t xml:space="preserve">hero photo</w:t>
-      </w:r>
-      <w:r>
-        <w:t xml:space="preserve">, the</w:t>
-      </w:r>
-      <w:r>
-        <w:t xml:space="preserve"> </w:t>
-      </w:r>
-      <w:r>
-        <w:rPr>
-          <w:b/>
-          <w:bCs/>
-        </w:rPr>
-        <w:t xml:space="preserve">“Topics in Research &amp; Analysis”</w:t>
-      </w:r>
-      <w:r>
-        <w:rPr>
-          <w:b/>
-          <w:bCs/>
-        </w:rPr>
-        <w:t xml:space="preserve"> </w:t>
-      </w:r>
-      <w:r>
-        <w:rPr>
-          <w:b/>
-          <w:bCs/>
-        </w:rPr>
-        <w:t xml:space="preserve">image</w:t>
-      </w:r>
-      <w:r>
-        <w:t xml:space="preserve">, and the real</w:t>
-      </w:r>
-      <w:r>
-        <w:t xml:space="preserve"> </w:t>
-      </w:r>
-      <w:r>
-        <w:rPr>
-          <w:b/>
-          <w:bCs/>
-        </w:rPr>
-        <w:t xml:space="preserve">homepage headline and introduction</w:t>
-      </w:r>
-      <w:r>
-        <w:t xml:space="preserve">.</w:t>
-      </w:r>
-    </w:p>
-    <w:p>
-      <w:pPr>
-        <w:pStyle w:val="Compact"/>
-        <w:numPr>
-          <w:ilvl w:val="1"/>
-          <w:numId w:val="1003"/>
-        </w:numPr>
-      </w:pPr>
-      <w:r>
-        <w:t xml:space="preserve">These are placeholders today, and the homepage is the first thing every visitor sees.</w:t>
-      </w:r>
-    </w:p>
-    <w:p>
-      <w:pPr>
-        <w:pStyle w:val="Compact"/>
-        <w:numPr>
-          <w:ilvl w:val="0"/>
-          <w:numId w:val="1004"/>
-        </w:numPr>
-      </w:pPr>
-      <w:r>
-        <w:rPr>
-          <w:b/>
-          <w:bCs/>
-        </w:rPr>
-        <w:t xml:space="preserve">Project descriptions (5 project pages)</w:t>
-      </w:r>
-      <w:r>
-        <w:t xml:space="preserve"> </w:t>
-      </w:r>
-      <w:r>
-        <w:t xml:space="preserve">— write the real write-up for each project.</w:t>
-      </w:r>
-    </w:p>
-    <w:p>
-      <w:pPr>
-        <w:pStyle w:val="Compact"/>
-        <w:numPr>
-          <w:ilvl w:val="1"/>
-          <w:numId w:val="1005"/>
-        </w:numPr>
-      </w:pPr>
-      <w:r>
-        <w:t xml:space="preserve">The five project pages currently share the same seeded placeholder text (the</w:t>
-      </w:r>
-      <w:r>
-        <w:t xml:space="preserve"> </w:t>
-      </w:r>
-      <w:r>
-        <w:t xml:space="preserve">“Justice Counts”</w:t>
-      </w:r>
-      <w:r>
-        <w:t xml:space="preserve"> </w:t>
-      </w:r>
-      <w:r>
-        <w:t xml:space="preserve">body).</w:t>
-      </w:r>
-    </w:p>
-    <w:p>
-      <w:pPr>
-        <w:pStyle w:val="Compact"/>
-        <w:numPr>
-          <w:ilvl w:val="1"/>
-          <w:numId w:val="1005"/>
-        </w:numPr>
-      </w:pPr>
-      <w:r>
-        <w:t xml:space="preserve">Each project needs its own summary/description.</w:t>
+        <w:t xml:space="preserve">One-time technical setups (for the development team).</w:t>
+      </w:r>
+      <w:r>
+        <w:t xml:space="preserve"> </w:t>
+      </w:r>
+      <w:r>
+        <w:t xml:space="preserve">A few items below can’t be started until a</w:t>
+      </w:r>
+      <w:r>
+        <w:t xml:space="preserve"> </w:t>
+      </w:r>
+      <w:r>
+        <w:t xml:space="preserve">small, one-time change is made in the content system. Collected here for the developers: (1) an image</w:t>
+      </w:r>
+      <w:r>
+        <w:t xml:space="preserve"> </w:t>
+      </w:r>
+      <w:r>
+        <w:t xml:space="preserve">field on Center; (2) an image field on Dataset; (3) a Center ↔ Article link; (4) Related Publications</w:t>
+      </w:r>
+      <w:r>
+        <w:t xml:space="preserve"> </w:t>
+      </w:r>
+      <w:r>
+        <w:t xml:space="preserve">/ Related Resources on Project; (5) a</w:t>
+      </w:r>
+      <w:r>
+        <w:t xml:space="preserve"> </w:t>
+      </w:r>
+      <w:r>
+        <w:t xml:space="preserve">“Related Content”</w:t>
+      </w:r>
+      <w:r>
+        <w:t xml:space="preserve"> </w:t>
+      </w:r>
+      <w:r>
+        <w:t xml:space="preserve">links field on Article. Each is flagged below</w:t>
+      </w:r>
+      <w:r>
+        <w:t xml:space="preserve"> </w:t>
+      </w:r>
+      <w:r>
+        <w:t xml:space="preserve">where it applies.</w:t>
       </w:r>
     </w:p>
     <w:p>
@@ -431,14 +363,35 @@
         </w:pict>
       </w:r>
     </w:p>
-    <w:bookmarkEnd w:id="10"/>
-    <w:bookmarkStart w:id="11" w:name="X65a815b9cd5707fa4cd3d91c0286ff2f3f1b409"/>
+    <w:bookmarkEnd w:id="9"/>
+    <w:bookmarkStart w:id="12" w:name="X0b81692463ed81ba9fbf77b56452c3258c8f1bf"/>
     <w:p>
       <w:pPr>
         <w:pStyle w:val="Heading2"/>
       </w:pPr>
       <w:r>
-        <w:t xml:space="preserve">2. Needs a quick content-system change first, then content</w:t>
+        <w:t xml:space="preserve">1. Ready to write now — no technical work needed</w:t>
+      </w:r>
+    </w:p>
+    <w:bookmarkStart w:id="10" w:name="Xe747cdb80b7f45c48f918f0bac355d26068e8d1"/>
+    <w:p>
+      <w:pPr>
+        <w:pStyle w:val="Heading3"/>
+      </w:pPr>
+      <w:r>
+        <w:t xml:space="preserve">1a. Homepage — author the</w:t>
+      </w:r>
+      <w:r>
+        <w:t xml:space="preserve"> </w:t>
+      </w:r>
+      <w:r>
+        <w:t xml:space="preserve">“Hub Home”</w:t>
+      </w:r>
+      <w:r>
+        <w:t xml:space="preserve"> </w:t>
+      </w:r>
+      <w:r>
+        <w:t xml:space="preserve">entry</w:t>
       </w:r>
     </w:p>
     <w:p>
@@ -446,57 +399,850 @@
         <w:pStyle w:val="FirstParagraph"/>
       </w:pPr>
       <w:r>
-        <w:t xml:space="preserve">For each of these, a developer makes a small one-time change in the CMS (adds a field or a</w:t>
-      </w:r>
-      <w:r>
-        <w:t xml:space="preserve"> </w:t>
-      </w:r>
-      <w:r>
-        <w:t xml:space="preserve">relationship); after that it is ordinary content entry.</w:t>
+        <w:t xml:space="preserve">Adds the homepage hero photo, the</w:t>
+      </w:r>
+      <w:r>
+        <w:t xml:space="preserve"> </w:t>
+      </w:r>
+      <w:r>
+        <w:t xml:space="preserve">“Topics in Research &amp; Analysis”</w:t>
+      </w:r>
+      <w:r>
+        <w:t xml:space="preserve"> </w:t>
+      </w:r>
+      <w:r>
+        <w:t xml:space="preserve">image, and the real homepage headline</w:t>
+      </w:r>
+      <w:r>
+        <w:t xml:space="preserve"> </w:t>
+      </w:r>
+      <w:r>
+        <w:t xml:space="preserve">and introduction (all placeholders today). The homepage is the first thing every visitor sees.</w:t>
+      </w:r>
+    </w:p>
+    <w:tbl>
+      <w:tblPr>
+        <w:tblStyle w:val="Table"/>
+        <w:tblW w:type="auto" w:w="0"/>
+        <w:tblLook w:firstRow="1" w:lastRow="0" w:firstColumn="0" w:lastColumn="0" w:noHBand="0" w:noVBand="0" w:val="0020"/>
+      </w:tblPr>
+      <w:tblGrid>
+        <w:gridCol w:w="1980"/>
+        <w:gridCol w:w="1980"/>
+        <w:gridCol w:w="1980"/>
+        <w:gridCol w:w="1980"/>
+      </w:tblGrid>
+      <w:tr>
+        <w:trPr>
+          <w:tblHeader w:val="on"/>
+        </w:trPr>
+        <w:tc>
+          <w:tcPr/>
+          <w:p>
+            <w:pPr>
+              <w:pStyle w:val="Compact"/>
+            </w:pPr>
+            <w:r>
+              <w:t xml:space="preserve">Piece</w:t>
+            </w:r>
+          </w:p>
+        </w:tc>
+        <w:tc>
+          <w:tcPr/>
+          <w:p>
+            <w:pPr>
+              <w:pStyle w:val="Compact"/>
+            </w:pPr>
+            <w:r>
+              <w:t xml:space="preserve">Owner</w:t>
+            </w:r>
+          </w:p>
+        </w:tc>
+        <w:tc>
+          <w:tcPr/>
+          <w:p>
+            <w:pPr>
+              <w:pStyle w:val="Compact"/>
+            </w:pPr>
+            <w:r>
+              <w:t xml:space="preserve">Target</w:t>
+            </w:r>
+          </w:p>
+        </w:tc>
+        <w:tc>
+          <w:tcPr/>
+          <w:p>
+            <w:pPr>
+              <w:pStyle w:val="Compact"/>
+            </w:pPr>
+            <w:r>
+              <w:t xml:space="preserve">Done</w:t>
+            </w:r>
+          </w:p>
+        </w:tc>
+      </w:tr>
+      <w:tr>
+        <w:tc>
+          <w:tcPr/>
+          <w:p>
+            <w:pPr>
+              <w:pStyle w:val="Compact"/>
+            </w:pPr>
+            <w:r>
+              <w:t xml:space="preserve">Hero photo</w:t>
+            </w:r>
+          </w:p>
+        </w:tc>
+        <w:tc>
+          <w:tcPr/>
+          <w:p>
+            <w:pPr>
+              <w:pStyle w:val="Compact"/>
+            </w:pPr>
+          </w:p>
+        </w:tc>
+        <w:tc>
+          <w:tcPr/>
+          <w:p>
+            <w:pPr>
+              <w:pStyle w:val="Compact"/>
+            </w:pPr>
+          </w:p>
+        </w:tc>
+        <w:tc>
+          <w:tcPr/>
+          <w:p>
+            <w:pPr>
+              <w:pStyle w:val="Compact"/>
+            </w:pPr>
+            <w:r>
+              <w:t xml:space="preserve">☐</w:t>
+            </w:r>
+          </w:p>
+        </w:tc>
+      </w:tr>
+      <w:tr>
+        <w:tc>
+          <w:tcPr/>
+          <w:p>
+            <w:pPr>
+              <w:pStyle w:val="Compact"/>
+            </w:pPr>
+            <w:r>
+              <w:t xml:space="preserve">“Topics in Research &amp; Analysis”</w:t>
+            </w:r>
+            <w:r>
+              <w:t xml:space="preserve"> </w:t>
+            </w:r>
+            <w:r>
+              <w:t xml:space="preserve">image</w:t>
+            </w:r>
+          </w:p>
+        </w:tc>
+        <w:tc>
+          <w:tcPr/>
+          <w:p>
+            <w:pPr>
+              <w:pStyle w:val="Compact"/>
+            </w:pPr>
+          </w:p>
+        </w:tc>
+        <w:tc>
+          <w:tcPr/>
+          <w:p>
+            <w:pPr>
+              <w:pStyle w:val="Compact"/>
+            </w:pPr>
+          </w:p>
+        </w:tc>
+        <w:tc>
+          <w:tcPr/>
+          <w:p>
+            <w:pPr>
+              <w:pStyle w:val="Compact"/>
+            </w:pPr>
+            <w:r>
+              <w:t xml:space="preserve">☐</w:t>
+            </w:r>
+          </w:p>
+        </w:tc>
+      </w:tr>
+      <w:tr>
+        <w:tc>
+          <w:tcPr/>
+          <w:p>
+            <w:pPr>
+              <w:pStyle w:val="Compact"/>
+            </w:pPr>
+            <w:r>
+              <w:t xml:space="preserve">Homepage headline + introduction copy</w:t>
+            </w:r>
+          </w:p>
+        </w:tc>
+        <w:tc>
+          <w:tcPr/>
+          <w:p>
+            <w:pPr>
+              <w:pStyle w:val="Compact"/>
+            </w:pPr>
+          </w:p>
+        </w:tc>
+        <w:tc>
+          <w:tcPr/>
+          <w:p>
+            <w:pPr>
+              <w:pStyle w:val="Compact"/>
+            </w:pPr>
+          </w:p>
+        </w:tc>
+        <w:tc>
+          <w:tcPr/>
+          <w:p>
+            <w:pPr>
+              <w:pStyle w:val="Compact"/>
+            </w:pPr>
+            <w:r>
+              <w:t xml:space="preserve">☐</w:t>
+            </w:r>
+          </w:p>
+        </w:tc>
+      </w:tr>
+    </w:tbl>
+    <w:bookmarkEnd w:id="10"/>
+    <w:bookmarkStart w:id="11" w:name="Xe409ab091626067866161c323734d87a53d4d38"/>
+    <w:p>
+      <w:pPr>
+        <w:pStyle w:val="Heading3"/>
+      </w:pPr>
+      <w:r>
+        <w:t xml:space="preserve">1b. Project write-ups (5)</w:t>
       </w:r>
     </w:p>
     <w:p>
       <w:pPr>
-        <w:pStyle w:val="Compact"/>
-        <w:numPr>
-          <w:ilvl w:val="0"/>
-          <w:numId w:val="1006"/>
-        </w:numPr>
-      </w:pPr>
-      <w:r>
-        <w:rPr>
-          <w:b/>
-          <w:bCs/>
-        </w:rPr>
-        <w:t xml:space="preserve">Center photos</w:t>
-      </w:r>
-      <w:r>
-        <w:t xml:space="preserve"> </w:t>
-      </w:r>
-      <w:r>
-        <w:t xml:space="preserve">— a photo for each research center.</w:t>
+        <w:pStyle w:val="FirstParagraph"/>
+      </w:pPr>
+      <w:r>
+        <w:t xml:space="preserve">Each project page needs its own real description; today all five share the same seeded placeholder text.</w:t>
       </w:r>
     </w:p>
+    <w:tbl>
+      <w:tblPr>
+        <w:tblStyle w:val="Table"/>
+        <w:tblW w:type="auto" w:w="0"/>
+        <w:tblLook w:firstRow="1" w:lastRow="0" w:firstColumn="0" w:lastColumn="0" w:noHBand="0" w:noVBand="0" w:val="0020"/>
+      </w:tblPr>
+      <w:tblGrid>
+        <w:gridCol w:w="1980"/>
+        <w:gridCol w:w="1980"/>
+        <w:gridCol w:w="1980"/>
+        <w:gridCol w:w="1980"/>
+      </w:tblGrid>
+      <w:tr>
+        <w:trPr>
+          <w:tblHeader w:val="on"/>
+        </w:trPr>
+        <w:tc>
+          <w:tcPr/>
+          <w:p>
+            <w:pPr>
+              <w:pStyle w:val="Compact"/>
+            </w:pPr>
+            <w:r>
+              <w:t xml:space="preserve">Project</w:t>
+            </w:r>
+          </w:p>
+        </w:tc>
+        <w:tc>
+          <w:tcPr/>
+          <w:p>
+            <w:pPr>
+              <w:pStyle w:val="Compact"/>
+            </w:pPr>
+            <w:r>
+              <w:t xml:space="preserve">Owner</w:t>
+            </w:r>
+          </w:p>
+        </w:tc>
+        <w:tc>
+          <w:tcPr/>
+          <w:p>
+            <w:pPr>
+              <w:pStyle w:val="Compact"/>
+            </w:pPr>
+            <w:r>
+              <w:t xml:space="preserve">Target</w:t>
+            </w:r>
+          </w:p>
+        </w:tc>
+        <w:tc>
+          <w:tcPr/>
+          <w:p>
+            <w:pPr>
+              <w:pStyle w:val="Compact"/>
+            </w:pPr>
+            <w:r>
+              <w:t xml:space="preserve">Done</w:t>
+            </w:r>
+          </w:p>
+        </w:tc>
+      </w:tr>
+      <w:tr>
+        <w:tc>
+          <w:tcPr/>
+          <w:p>
+            <w:pPr>
+              <w:pStyle w:val="Compact"/>
+            </w:pPr>
+            <w:r>
+              <w:t xml:space="preserve">Justice Counts Implementation Program</w:t>
+            </w:r>
+          </w:p>
+        </w:tc>
+        <w:tc>
+          <w:tcPr/>
+          <w:p>
+            <w:pPr>
+              <w:pStyle w:val="Compact"/>
+            </w:pPr>
+          </w:p>
+        </w:tc>
+        <w:tc>
+          <w:tcPr/>
+          <w:p>
+            <w:pPr>
+              <w:pStyle w:val="Compact"/>
+            </w:pPr>
+          </w:p>
+        </w:tc>
+        <w:tc>
+          <w:tcPr/>
+          <w:p>
+            <w:pPr>
+              <w:pStyle w:val="Compact"/>
+            </w:pPr>
+            <w:r>
+              <w:t xml:space="preserve">☐</w:t>
+            </w:r>
+          </w:p>
+        </w:tc>
+      </w:tr>
+      <w:tr>
+        <w:tc>
+          <w:tcPr/>
+          <w:p>
+            <w:pPr>
+              <w:pStyle w:val="Compact"/>
+            </w:pPr>
+            <w:r>
+              <w:t xml:space="preserve">Restore, Reinvest, Renew (R3)</w:t>
+            </w:r>
+          </w:p>
+        </w:tc>
+        <w:tc>
+          <w:tcPr/>
+          <w:p>
+            <w:pPr>
+              <w:pStyle w:val="Compact"/>
+            </w:pPr>
+          </w:p>
+        </w:tc>
+        <w:tc>
+          <w:tcPr/>
+          <w:p>
+            <w:pPr>
+              <w:pStyle w:val="Compact"/>
+            </w:pPr>
+          </w:p>
+        </w:tc>
+        <w:tc>
+          <w:tcPr/>
+          <w:p>
+            <w:pPr>
+              <w:pStyle w:val="Compact"/>
+            </w:pPr>
+            <w:r>
+              <w:t xml:space="preserve">☐</w:t>
+            </w:r>
+          </w:p>
+        </w:tc>
+      </w:tr>
+      <w:tr>
+        <w:tc>
+          <w:tcPr/>
+          <w:p>
+            <w:pPr>
+              <w:pStyle w:val="Compact"/>
+            </w:pPr>
+            <w:r>
+              <w:t xml:space="preserve">Deaths in Custody</w:t>
+            </w:r>
+          </w:p>
+        </w:tc>
+        <w:tc>
+          <w:tcPr/>
+          <w:p>
+            <w:pPr>
+              <w:pStyle w:val="Compact"/>
+            </w:pPr>
+          </w:p>
+        </w:tc>
+        <w:tc>
+          <w:tcPr/>
+          <w:p>
+            <w:pPr>
+              <w:pStyle w:val="Compact"/>
+            </w:pPr>
+          </w:p>
+        </w:tc>
+        <w:tc>
+          <w:tcPr/>
+          <w:p>
+            <w:pPr>
+              <w:pStyle w:val="Compact"/>
+            </w:pPr>
+            <w:r>
+              <w:t xml:space="preserve">☐</w:t>
+            </w:r>
+          </w:p>
+        </w:tc>
+      </w:tr>
+      <w:tr>
+        <w:tc>
+          <w:tcPr/>
+          <w:p>
+            <w:pPr>
+              <w:pStyle w:val="Compact"/>
+            </w:pPr>
+            <w:r>
+              <w:t xml:space="preserve">Illinois Uniform Crime Report</w:t>
+            </w:r>
+          </w:p>
+        </w:tc>
+        <w:tc>
+          <w:tcPr/>
+          <w:p>
+            <w:pPr>
+              <w:pStyle w:val="Compact"/>
+            </w:pPr>
+          </w:p>
+        </w:tc>
+        <w:tc>
+          <w:tcPr/>
+          <w:p>
+            <w:pPr>
+              <w:pStyle w:val="Compact"/>
+            </w:pPr>
+          </w:p>
+        </w:tc>
+        <w:tc>
+          <w:tcPr/>
+          <w:p>
+            <w:pPr>
+              <w:pStyle w:val="Compact"/>
+            </w:pPr>
+            <w:r>
+              <w:t xml:space="preserve">☐</w:t>
+            </w:r>
+          </w:p>
+        </w:tc>
+      </w:tr>
+      <w:tr>
+        <w:tc>
+          <w:tcPr/>
+          <w:p>
+            <w:pPr>
+              <w:pStyle w:val="Compact"/>
+            </w:pPr>
+            <w:r>
+              <w:t xml:space="preserve">Violence Prevention Research</w:t>
+            </w:r>
+          </w:p>
+        </w:tc>
+        <w:tc>
+          <w:tcPr/>
+          <w:p>
+            <w:pPr>
+              <w:pStyle w:val="Compact"/>
+            </w:pPr>
+          </w:p>
+        </w:tc>
+        <w:tc>
+          <w:tcPr/>
+          <w:p>
+            <w:pPr>
+              <w:pStyle w:val="Compact"/>
+            </w:pPr>
+          </w:p>
+        </w:tc>
+        <w:tc>
+          <w:tcPr/>
+          <w:p>
+            <w:pPr>
+              <w:pStyle w:val="Compact"/>
+            </w:pPr>
+            <w:r>
+              <w:t xml:space="preserve">☐</w:t>
+            </w:r>
+          </w:p>
+        </w:tc>
+      </w:tr>
+    </w:tbl>
     <w:p>
-      <w:pPr>
-        <w:pStyle w:val="Compact"/>
-        <w:numPr>
-          <w:ilvl w:val="1"/>
-          <w:numId w:val="1007"/>
-        </w:numPr>
-      </w:pPr>
+      <w:r>
+        <w:pict>
+          <v:rect style="width:0;height:1.5pt" o:hralign="center" o:hrstd="t" o:hr="t"/>
+        </w:pict>
+      </w:r>
+    </w:p>
+    <w:bookmarkEnd w:id="11"/>
+    <w:bookmarkEnd w:id="12"/>
+    <w:bookmarkStart w:id="18" w:name="X74c0ea865c0706f3eaedf70683542a5f014a943"/>
+    <w:p>
+      <w:pPr>
+        <w:pStyle w:val="Heading2"/>
+      </w:pPr>
+      <w:r>
+        <w:t xml:space="preserve">2. Needs a one-time system change first, then content</w:t>
+      </w:r>
+    </w:p>
+    <w:bookmarkStart w:id="13" w:name="Xf1f44458ca10b94a1c6f322bf8482162f06252c"/>
+    <w:p>
+      <w:pPr>
+        <w:pStyle w:val="Heading3"/>
+      </w:pPr>
+      <w:r>
+        <w:t xml:space="preserve">2a. Center photos (6) —</w:t>
+      </w:r>
+      <w:r>
+        <w:t xml:space="preserve"> </w:t>
+      </w:r>
       <w:r>
         <w:rPr>
           <w:i/>
           <w:iCs/>
         </w:rPr>
-        <w:t xml:space="preserve">Technical step first:</w:t>
-      </w:r>
-      <w:r>
-        <w:t xml:space="preserve"> </w:t>
-      </w:r>
-      <w:r>
-        <w:t xml:space="preserve">add an image field to the Center type.</w:t>
+        <w:t xml:space="preserve">setup: image field on Center</w:t>
+      </w:r>
+    </w:p>
+    <w:p>
+      <w:pPr>
+        <w:pStyle w:val="FirstParagraph"/>
+      </w:pPr>
+      <w:r>
+        <w:t xml:space="preserve">One photo per research center (center pages have none today).</w:t>
+      </w:r>
+    </w:p>
+    <w:tbl>
+      <w:tblPr>
+        <w:tblStyle w:val="Table"/>
+        <w:tblW w:type="auto" w:w="0"/>
+        <w:tblLook w:firstRow="1" w:lastRow="0" w:firstColumn="0" w:lastColumn="0" w:noHBand="0" w:noVBand="0" w:val="0020"/>
+      </w:tblPr>
+      <w:tblGrid>
+        <w:gridCol w:w="1980"/>
+        <w:gridCol w:w="1980"/>
+        <w:gridCol w:w="1980"/>
+        <w:gridCol w:w="1980"/>
+      </w:tblGrid>
+      <w:tr>
+        <w:trPr>
+          <w:tblHeader w:val="on"/>
+        </w:trPr>
+        <w:tc>
+          <w:tcPr/>
+          <w:p>
+            <w:pPr>
+              <w:pStyle w:val="Compact"/>
+            </w:pPr>
+            <w:r>
+              <w:t xml:space="preserve">Center</w:t>
+            </w:r>
+          </w:p>
+        </w:tc>
+        <w:tc>
+          <w:tcPr/>
+          <w:p>
+            <w:pPr>
+              <w:pStyle w:val="Compact"/>
+            </w:pPr>
+            <w:r>
+              <w:t xml:space="preserve">Owner</w:t>
+            </w:r>
+          </w:p>
+        </w:tc>
+        <w:tc>
+          <w:tcPr/>
+          <w:p>
+            <w:pPr>
+              <w:pStyle w:val="Compact"/>
+            </w:pPr>
+            <w:r>
+              <w:t xml:space="preserve">Target</w:t>
+            </w:r>
+          </w:p>
+        </w:tc>
+        <w:tc>
+          <w:tcPr/>
+          <w:p>
+            <w:pPr>
+              <w:pStyle w:val="Compact"/>
+            </w:pPr>
+            <w:r>
+              <w:t xml:space="preserve">Done</w:t>
+            </w:r>
+          </w:p>
+        </w:tc>
+      </w:tr>
+      <w:tr>
+        <w:tc>
+          <w:tcPr/>
+          <w:p>
+            <w:pPr>
+              <w:pStyle w:val="Compact"/>
+            </w:pPr>
+            <w:r>
+              <w:t xml:space="preserve">Center for Community Corrections Research</w:t>
+            </w:r>
+          </w:p>
+        </w:tc>
+        <w:tc>
+          <w:tcPr/>
+          <w:p>
+            <w:pPr>
+              <w:pStyle w:val="Compact"/>
+            </w:pPr>
+          </w:p>
+        </w:tc>
+        <w:tc>
+          <w:tcPr/>
+          <w:p>
+            <w:pPr>
+              <w:pStyle w:val="Compact"/>
+            </w:pPr>
+          </w:p>
+        </w:tc>
+        <w:tc>
+          <w:tcPr/>
+          <w:p>
+            <w:pPr>
+              <w:pStyle w:val="Compact"/>
+            </w:pPr>
+            <w:r>
+              <w:t xml:space="preserve">☐</w:t>
+            </w:r>
+          </w:p>
+        </w:tc>
+      </w:tr>
+      <w:tr>
+        <w:tc>
+          <w:tcPr/>
+          <w:p>
+            <w:pPr>
+              <w:pStyle w:val="Compact"/>
+            </w:pPr>
+            <w:r>
+              <w:t xml:space="preserve">Center for Criminal Justice Data and Analytics</w:t>
+            </w:r>
+          </w:p>
+        </w:tc>
+        <w:tc>
+          <w:tcPr/>
+          <w:p>
+            <w:pPr>
+              <w:pStyle w:val="Compact"/>
+            </w:pPr>
+          </w:p>
+        </w:tc>
+        <w:tc>
+          <w:tcPr/>
+          <w:p>
+            <w:pPr>
+              <w:pStyle w:val="Compact"/>
+            </w:pPr>
+          </w:p>
+        </w:tc>
+        <w:tc>
+          <w:tcPr/>
+          <w:p>
+            <w:pPr>
+              <w:pStyle w:val="Compact"/>
+            </w:pPr>
+            <w:r>
+              <w:t xml:space="preserve">☐</w:t>
+            </w:r>
+          </w:p>
+        </w:tc>
+      </w:tr>
+      <w:tr>
+        <w:tc>
+          <w:tcPr/>
+          <w:p>
+            <w:pPr>
+              <w:pStyle w:val="Compact"/>
+            </w:pPr>
+            <w:r>
+              <w:t xml:space="preserve">Center for Justice Research and Evaluation</w:t>
+            </w:r>
+          </w:p>
+        </w:tc>
+        <w:tc>
+          <w:tcPr/>
+          <w:p>
+            <w:pPr>
+              <w:pStyle w:val="Compact"/>
+            </w:pPr>
+          </w:p>
+        </w:tc>
+        <w:tc>
+          <w:tcPr/>
+          <w:p>
+            <w:pPr>
+              <w:pStyle w:val="Compact"/>
+            </w:pPr>
+          </w:p>
+        </w:tc>
+        <w:tc>
+          <w:tcPr/>
+          <w:p>
+            <w:pPr>
+              <w:pStyle w:val="Compact"/>
+            </w:pPr>
+            <w:r>
+              <w:t xml:space="preserve">☐</w:t>
+            </w:r>
+          </w:p>
+        </w:tc>
+      </w:tr>
+      <w:tr>
+        <w:tc>
+          <w:tcPr/>
+          <w:p>
+            <w:pPr>
+              <w:pStyle w:val="Compact"/>
+            </w:pPr>
+            <w:r>
+              <w:t xml:space="preserve">Center for Sponsored Research &amp; Program Development</w:t>
+            </w:r>
+          </w:p>
+        </w:tc>
+        <w:tc>
+          <w:tcPr/>
+          <w:p>
+            <w:pPr>
+              <w:pStyle w:val="Compact"/>
+            </w:pPr>
+          </w:p>
+        </w:tc>
+        <w:tc>
+          <w:tcPr/>
+          <w:p>
+            <w:pPr>
+              <w:pStyle w:val="Compact"/>
+            </w:pPr>
+          </w:p>
+        </w:tc>
+        <w:tc>
+          <w:tcPr/>
+          <w:p>
+            <w:pPr>
+              <w:pStyle w:val="Compact"/>
+            </w:pPr>
+            <w:r>
+              <w:t xml:space="preserve">☐</w:t>
+            </w:r>
+          </w:p>
+        </w:tc>
+      </w:tr>
+      <w:tr>
+        <w:tc>
+          <w:tcPr/>
+          <w:p>
+            <w:pPr>
+              <w:pStyle w:val="Compact"/>
+            </w:pPr>
+            <w:r>
+              <w:t xml:space="preserve">Center for Victim Studies</w:t>
+            </w:r>
+          </w:p>
+        </w:tc>
+        <w:tc>
+          <w:tcPr/>
+          <w:p>
+            <w:pPr>
+              <w:pStyle w:val="Compact"/>
+            </w:pPr>
+          </w:p>
+        </w:tc>
+        <w:tc>
+          <w:tcPr/>
+          <w:p>
+            <w:pPr>
+              <w:pStyle w:val="Compact"/>
+            </w:pPr>
+          </w:p>
+        </w:tc>
+        <w:tc>
+          <w:tcPr/>
+          <w:p>
+            <w:pPr>
+              <w:pStyle w:val="Compact"/>
+            </w:pPr>
+            <w:r>
+              <w:t xml:space="preserve">☐</w:t>
+            </w:r>
+          </w:p>
+        </w:tc>
+      </w:tr>
+      <w:tr>
+        <w:tc>
+          <w:tcPr/>
+          <w:p>
+            <w:pPr>
+              <w:pStyle w:val="Compact"/>
+            </w:pPr>
+            <w:r>
+              <w:t xml:space="preserve">Center for Violence Prevention and Intervention Research</w:t>
+            </w:r>
+          </w:p>
+        </w:tc>
+        <w:tc>
+          <w:tcPr/>
+          <w:p>
+            <w:pPr>
+              <w:pStyle w:val="Compact"/>
+            </w:pPr>
+          </w:p>
+        </w:tc>
+        <w:tc>
+          <w:tcPr/>
+          <w:p>
+            <w:pPr>
+              <w:pStyle w:val="Compact"/>
+            </w:pPr>
+          </w:p>
+        </w:tc>
+        <w:tc>
+          <w:tcPr/>
+          <w:p>
+            <w:pPr>
+              <w:pStyle w:val="Compact"/>
+            </w:pPr>
+            <w:r>
+              <w:t xml:space="preserve">☐</w:t>
+            </w:r>
+          </w:p>
+        </w:tc>
+      </w:tr>
+    </w:tbl>
+    <w:bookmarkEnd w:id="13"/>
+    <w:bookmarkStart w:id="14" w:name="X979ffe7352d1757b34e29497d0206e4d0b82724"/>
+    <w:p>
+      <w:pPr>
+        <w:pStyle w:val="Heading3"/>
+      </w:pPr>
+      <w:r>
+        <w:t xml:space="preserve">2b. Dataset thumbnails (5) —</w:t>
       </w:r>
       <w:r>
         <w:t xml:space="preserve"> </w:t>
@@ -506,75 +1252,453 @@
           <w:i/>
           <w:iCs/>
         </w:rPr>
-        <w:t xml:space="preserve">Then:</w:t>
-      </w:r>
-      <w:r>
-        <w:t xml:space="preserve"> </w:t>
-      </w:r>
-      <w:r>
-        <w:t xml:space="preserve">upload one photo per</w:t>
-      </w:r>
-      <w:r>
-        <w:t xml:space="preserve"> </w:t>
-      </w:r>
-      <w:r>
-        <w:t xml:space="preserve">center.</w:t>
+        <w:t xml:space="preserve">setup: image field on Dataset</w:t>
       </w:r>
     </w:p>
     <w:p>
       <w:pPr>
-        <w:pStyle w:val="Compact"/>
-        <w:numPr>
-          <w:ilvl w:val="1"/>
-          <w:numId w:val="1007"/>
-        </w:numPr>
-      </w:pPr>
-      <w:r>
-        <w:t xml:space="preserve">Center pages have no photo today.</w:t>
+        <w:pStyle w:val="FirstParagraph"/>
+      </w:pPr>
+      <w:r>
+        <w:t xml:space="preserve">A small preview image per dataset.</w:t>
       </w:r>
     </w:p>
+    <w:tbl>
+      <w:tblPr>
+        <w:tblStyle w:val="Table"/>
+        <w:tblW w:type="auto" w:w="0"/>
+        <w:tblLook w:firstRow="1" w:lastRow="0" w:firstColumn="0" w:lastColumn="0" w:noHBand="0" w:noVBand="0" w:val="0020"/>
+      </w:tblPr>
+      <w:tblGrid>
+        <w:gridCol w:w="1980"/>
+        <w:gridCol w:w="1980"/>
+        <w:gridCol w:w="1980"/>
+        <w:gridCol w:w="1980"/>
+      </w:tblGrid>
+      <w:tr>
+        <w:trPr>
+          <w:tblHeader w:val="on"/>
+        </w:trPr>
+        <w:tc>
+          <w:tcPr/>
+          <w:p>
+            <w:pPr>
+              <w:pStyle w:val="Compact"/>
+            </w:pPr>
+            <w:r>
+              <w:t xml:space="preserve">Dataset</w:t>
+            </w:r>
+          </w:p>
+        </w:tc>
+        <w:tc>
+          <w:tcPr/>
+          <w:p>
+            <w:pPr>
+              <w:pStyle w:val="Compact"/>
+            </w:pPr>
+            <w:r>
+              <w:t xml:space="preserve">Owner</w:t>
+            </w:r>
+          </w:p>
+        </w:tc>
+        <w:tc>
+          <w:tcPr/>
+          <w:p>
+            <w:pPr>
+              <w:pStyle w:val="Compact"/>
+            </w:pPr>
+            <w:r>
+              <w:t xml:space="preserve">Target</w:t>
+            </w:r>
+          </w:p>
+        </w:tc>
+        <w:tc>
+          <w:tcPr/>
+          <w:p>
+            <w:pPr>
+              <w:pStyle w:val="Compact"/>
+            </w:pPr>
+            <w:r>
+              <w:t xml:space="preserve">Done</w:t>
+            </w:r>
+          </w:p>
+        </w:tc>
+      </w:tr>
+      <w:tr>
+        <w:tc>
+          <w:tcPr/>
+          <w:p>
+            <w:pPr>
+              <w:pStyle w:val="Compact"/>
+            </w:pPr>
+            <w:r>
+              <w:t xml:space="preserve">Death in Custody Reports</w:t>
+            </w:r>
+          </w:p>
+        </w:tc>
+        <w:tc>
+          <w:tcPr/>
+          <w:p>
+            <w:pPr>
+              <w:pStyle w:val="Compact"/>
+            </w:pPr>
+          </w:p>
+        </w:tc>
+        <w:tc>
+          <w:tcPr/>
+          <w:p>
+            <w:pPr>
+              <w:pStyle w:val="Compact"/>
+            </w:pPr>
+          </w:p>
+        </w:tc>
+        <w:tc>
+          <w:tcPr/>
+          <w:p>
+            <w:pPr>
+              <w:pStyle w:val="Compact"/>
+            </w:pPr>
+            <w:r>
+              <w:t xml:space="preserve">☐</w:t>
+            </w:r>
+          </w:p>
+        </w:tc>
+      </w:tr>
+      <w:tr>
+        <w:tc>
+          <w:tcPr/>
+          <w:p>
+            <w:pPr>
+              <w:pStyle w:val="Compact"/>
+            </w:pPr>
+            <w:r>
+              <w:t xml:space="preserve">Illinois Juvenile Justice Data Dashboard</w:t>
+            </w:r>
+          </w:p>
+        </w:tc>
+        <w:tc>
+          <w:tcPr/>
+          <w:p>
+            <w:pPr>
+              <w:pStyle w:val="Compact"/>
+            </w:pPr>
+          </w:p>
+        </w:tc>
+        <w:tc>
+          <w:tcPr/>
+          <w:p>
+            <w:pPr>
+              <w:pStyle w:val="Compact"/>
+            </w:pPr>
+          </w:p>
+        </w:tc>
+        <w:tc>
+          <w:tcPr/>
+          <w:p>
+            <w:pPr>
+              <w:pStyle w:val="Compact"/>
+            </w:pPr>
+            <w:r>
+              <w:t xml:space="preserve">☐</w:t>
+            </w:r>
+          </w:p>
+        </w:tc>
+      </w:tr>
+      <w:tr>
+        <w:tc>
+          <w:tcPr/>
+          <w:p>
+            <w:pPr>
+              <w:pStyle w:val="Compact"/>
+            </w:pPr>
+            <w:r>
+              <w:t xml:space="preserve">Illinois Uniform Crime Reports (UCR) Index Crime Offense</w:t>
+            </w:r>
+          </w:p>
+        </w:tc>
+        <w:tc>
+          <w:tcPr/>
+          <w:p>
+            <w:pPr>
+              <w:pStyle w:val="Compact"/>
+            </w:pPr>
+          </w:p>
+        </w:tc>
+        <w:tc>
+          <w:tcPr/>
+          <w:p>
+            <w:pPr>
+              <w:pStyle w:val="Compact"/>
+            </w:pPr>
+          </w:p>
+        </w:tc>
+        <w:tc>
+          <w:tcPr/>
+          <w:p>
+            <w:pPr>
+              <w:pStyle w:val="Compact"/>
+            </w:pPr>
+            <w:r>
+              <w:t xml:space="preserve">☐</w:t>
+            </w:r>
+          </w:p>
+        </w:tc>
+      </w:tr>
+      <w:tr>
+        <w:tc>
+          <w:tcPr/>
+          <w:p>
+            <w:pPr>
+              <w:pStyle w:val="Compact"/>
+            </w:pPr>
+            <w:r>
+              <w:t xml:space="preserve">Illinois Uniform Crime Reports (UCR) Index Crime Arrest</w:t>
+            </w:r>
+          </w:p>
+        </w:tc>
+        <w:tc>
+          <w:tcPr/>
+          <w:p>
+            <w:pPr>
+              <w:pStyle w:val="Compact"/>
+            </w:pPr>
+          </w:p>
+        </w:tc>
+        <w:tc>
+          <w:tcPr/>
+          <w:p>
+            <w:pPr>
+              <w:pStyle w:val="Compact"/>
+            </w:pPr>
+          </w:p>
+        </w:tc>
+        <w:tc>
+          <w:tcPr/>
+          <w:p>
+            <w:pPr>
+              <w:pStyle w:val="Compact"/>
+            </w:pPr>
+            <w:r>
+              <w:t xml:space="preserve">☐</w:t>
+            </w:r>
+          </w:p>
+        </w:tc>
+      </w:tr>
+      <w:tr>
+        <w:tc>
+          <w:tcPr/>
+          <w:p>
+            <w:pPr>
+              <w:pStyle w:val="Compact"/>
+            </w:pPr>
+            <w:r>
+              <w:t xml:space="preserve">Illinois Uniform Crime Reports (UCR) Hate Crime Offense</w:t>
+            </w:r>
+          </w:p>
+        </w:tc>
+        <w:tc>
+          <w:tcPr/>
+          <w:p>
+            <w:pPr>
+              <w:pStyle w:val="Compact"/>
+            </w:pPr>
+          </w:p>
+        </w:tc>
+        <w:tc>
+          <w:tcPr/>
+          <w:p>
+            <w:pPr>
+              <w:pStyle w:val="Compact"/>
+            </w:pPr>
+          </w:p>
+        </w:tc>
+        <w:tc>
+          <w:tcPr/>
+          <w:p>
+            <w:pPr>
+              <w:pStyle w:val="Compact"/>
+            </w:pPr>
+            <w:r>
+              <w:t xml:space="preserve">☐</w:t>
+            </w:r>
+          </w:p>
+        </w:tc>
+      </w:tr>
+    </w:tbl>
+    <w:bookmarkEnd w:id="14"/>
+    <w:bookmarkStart w:id="15" w:name="X55b4af7cb619b3d1bee8a144cf9867b46a172e6"/>
     <w:p>
       <w:pPr>
-        <w:pStyle w:val="Compact"/>
-        <w:numPr>
-          <w:ilvl w:val="0"/>
-          <w:numId w:val="1008"/>
-        </w:numPr>
-      </w:pPr>
-      <w:r>
-        <w:rPr>
-          <w:b/>
-          <w:bCs/>
-        </w:rPr>
-        <w:t xml:space="preserve">Dataset thumbnails</w:t>
-      </w:r>
-      <w:r>
-        <w:t xml:space="preserve"> </w:t>
-      </w:r>
-      <w:r>
-        <w:t xml:space="preserve">— a small preview image for each dataset.</w:t>
-      </w:r>
-    </w:p>
-    <w:p>
-      <w:pPr>
-        <w:pStyle w:val="Compact"/>
-        <w:numPr>
-          <w:ilvl w:val="1"/>
-          <w:numId w:val="1009"/>
-        </w:numPr>
-      </w:pPr>
+        <w:pStyle w:val="Heading3"/>
+      </w:pPr>
+      <w:r>
+        <w:t xml:space="preserve">2c.</w:t>
+      </w:r>
+      <w:r>
+        <w:t xml:space="preserve"> </w:t>
+      </w:r>
+      <w:r>
+        <w:t xml:space="preserve">“Filter articles by center”</w:t>
+      </w:r>
+      <w:r>
+        <w:t xml:space="preserve"> </w:t>
+      </w:r>
+      <w:r>
+        <w:t xml:space="preserve">—</w:t>
+      </w:r>
+      <w:r>
+        <w:t xml:space="preserve"> </w:t>
+      </w:r>
       <w:r>
         <w:rPr>
           <w:i/>
           <w:iCs/>
         </w:rPr>
-        <w:t xml:space="preserve">Technical step first:</w:t>
-      </w:r>
-      <w:r>
-        <w:t xml:space="preserve"> </w:t>
-      </w:r>
-      <w:r>
-        <w:t xml:space="preserve">add an image field.</w:t>
+        <w:t xml:space="preserve">setup: Center ↔ Article link</w:t>
+      </w:r>
+    </w:p>
+    <w:p>
+      <w:pPr>
+        <w:pStyle w:val="FirstParagraph"/>
+      </w:pPr>
+      <w:r>
+        <w:t xml:space="preserve">Turns on the design’s</w:t>
+      </w:r>
+      <w:r>
+        <w:t xml:space="preserve"> </w:t>
+      </w:r>
+      <w:r>
+        <w:t xml:space="preserve">“All Centers”</w:t>
+      </w:r>
+      <w:r>
+        <w:t xml:space="preserve"> </w:t>
+      </w:r>
+      <w:r>
+        <w:t xml:space="preserve">filter on the Articles page. Once the link exists, each published</w:t>
+      </w:r>
+      <w:r>
+        <w:t xml:space="preserve"> </w:t>
+      </w:r>
+      <w:r>
+        <w:t xml:space="preserve">article is tagged with its center. This is a bulk editorial pass (~236 published articles) and can be</w:t>
+      </w:r>
+      <w:r>
+        <w:t xml:space="preserve"> </w:t>
+      </w:r>
+      <w:r>
+        <w:t xml:space="preserve">split among editors.</w:t>
+      </w:r>
+    </w:p>
+    <w:tbl>
+      <w:tblPr>
+        <w:tblStyle w:val="Table"/>
+        <w:tblW w:type="auto" w:w="0"/>
+        <w:tblLook w:firstRow="1" w:lastRow="0" w:firstColumn="0" w:lastColumn="0" w:noHBand="0" w:noVBand="0" w:val="0020"/>
+      </w:tblPr>
+      <w:tblGrid>
+        <w:gridCol w:w="1980"/>
+        <w:gridCol w:w="1980"/>
+        <w:gridCol w:w="1980"/>
+        <w:gridCol w:w="1980"/>
+      </w:tblGrid>
+      <w:tr>
+        <w:trPr>
+          <w:tblHeader w:val="on"/>
+        </w:trPr>
+        <w:tc>
+          <w:tcPr/>
+          <w:p>
+            <w:pPr>
+              <w:pStyle w:val="Compact"/>
+            </w:pPr>
+            <w:r>
+              <w:t xml:space="preserve">Task</w:t>
+            </w:r>
+          </w:p>
+        </w:tc>
+        <w:tc>
+          <w:tcPr/>
+          <w:p>
+            <w:pPr>
+              <w:pStyle w:val="Compact"/>
+            </w:pPr>
+            <w:r>
+              <w:t xml:space="preserve">Owner</w:t>
+            </w:r>
+          </w:p>
+        </w:tc>
+        <w:tc>
+          <w:tcPr/>
+          <w:p>
+            <w:pPr>
+              <w:pStyle w:val="Compact"/>
+            </w:pPr>
+            <w:r>
+              <w:t xml:space="preserve">Target</w:t>
+            </w:r>
+          </w:p>
+        </w:tc>
+        <w:tc>
+          <w:tcPr/>
+          <w:p>
+            <w:pPr>
+              <w:pStyle w:val="Compact"/>
+            </w:pPr>
+            <w:r>
+              <w:t xml:space="preserve">Done</w:t>
+            </w:r>
+          </w:p>
+        </w:tc>
+      </w:tr>
+      <w:tr>
+        <w:tc>
+          <w:tcPr/>
+          <w:p>
+            <w:pPr>
+              <w:pStyle w:val="Compact"/>
+            </w:pPr>
+            <w:r>
+              <w:t xml:space="preserve">Tag published articles with their center (~236 articles)</w:t>
+            </w:r>
+          </w:p>
+        </w:tc>
+        <w:tc>
+          <w:tcPr/>
+          <w:p>
+            <w:pPr>
+              <w:pStyle w:val="Compact"/>
+            </w:pPr>
+          </w:p>
+        </w:tc>
+        <w:tc>
+          <w:tcPr/>
+          <w:p>
+            <w:pPr>
+              <w:pStyle w:val="Compact"/>
+            </w:pPr>
+          </w:p>
+        </w:tc>
+        <w:tc>
+          <w:tcPr/>
+          <w:p>
+            <w:pPr>
+              <w:pStyle w:val="Compact"/>
+            </w:pPr>
+            <w:r>
+              <w:t xml:space="preserve">☐</w:t>
+            </w:r>
+          </w:p>
+        </w:tc>
+      </w:tr>
+    </w:tbl>
+    <w:bookmarkEnd w:id="15"/>
+    <w:bookmarkStart w:id="16" w:name="X6e166ffeaf52e3455879c96929f4d4254735da2"/>
+    <w:p>
+      <w:pPr>
+        <w:pStyle w:val="Heading3"/>
+      </w:pPr>
+      <w:r>
+        <w:t xml:space="preserve">2d. Related Publications &amp; Resources on project pages (5) —</w:t>
       </w:r>
       <w:r>
         <w:t xml:space="preserve"> </w:t>
@@ -584,295 +1708,439 @@
           <w:i/>
           <w:iCs/>
         </w:rPr>
-        <w:t xml:space="preserve">Then:</w:t>
-      </w:r>
-      <w:r>
-        <w:t xml:space="preserve"> </w:t>
-      </w:r>
-      <w:r>
-        <w:t xml:space="preserve">upload the thumbnails.</w:t>
+        <w:t xml:space="preserve">setup: relations/fields on Project</w:t>
       </w:r>
     </w:p>
     <w:p>
       <w:pPr>
-        <w:pStyle w:val="Compact"/>
-        <w:numPr>
-          <w:ilvl w:val="0"/>
-          <w:numId w:val="1010"/>
-        </w:numPr>
-      </w:pPr>
-      <w:r>
-        <w:rPr>
-          <w:b/>
-          <w:bCs/>
-        </w:rPr>
-        <w:t xml:space="preserve">“Filter articles by center”</w:t>
-      </w:r>
-      <w:r>
-        <w:t xml:space="preserve"> </w:t>
-      </w:r>
-      <w:r>
-        <w:t xml:space="preserve">— connect each article to its research center.</w:t>
+        <w:pStyle w:val="FirstParagraph"/>
+      </w:pPr>
+      <w:r>
+        <w:t xml:space="preserve">Link each project to its related publications and downloadable resources.</w:t>
       </w:r>
     </w:p>
+    <w:tbl>
+      <w:tblPr>
+        <w:tblStyle w:val="Table"/>
+        <w:tblW w:type="auto" w:w="0"/>
+        <w:tblLook w:firstRow="1" w:lastRow="0" w:firstColumn="0" w:lastColumn="0" w:noHBand="0" w:noVBand="0" w:val="0020"/>
+      </w:tblPr>
+      <w:tblGrid>
+        <w:gridCol w:w="1980"/>
+        <w:gridCol w:w="1980"/>
+        <w:gridCol w:w="1980"/>
+        <w:gridCol w:w="1980"/>
+      </w:tblGrid>
+      <w:tr>
+        <w:trPr>
+          <w:tblHeader w:val="on"/>
+        </w:trPr>
+        <w:tc>
+          <w:tcPr/>
+          <w:p>
+            <w:pPr>
+              <w:pStyle w:val="Compact"/>
+            </w:pPr>
+            <w:r>
+              <w:t xml:space="preserve">Project</w:t>
+            </w:r>
+          </w:p>
+        </w:tc>
+        <w:tc>
+          <w:tcPr/>
+          <w:p>
+            <w:pPr>
+              <w:pStyle w:val="Compact"/>
+            </w:pPr>
+            <w:r>
+              <w:t xml:space="preserve">Owner</w:t>
+            </w:r>
+          </w:p>
+        </w:tc>
+        <w:tc>
+          <w:tcPr/>
+          <w:p>
+            <w:pPr>
+              <w:pStyle w:val="Compact"/>
+            </w:pPr>
+            <w:r>
+              <w:t xml:space="preserve">Target</w:t>
+            </w:r>
+          </w:p>
+        </w:tc>
+        <w:tc>
+          <w:tcPr/>
+          <w:p>
+            <w:pPr>
+              <w:pStyle w:val="Compact"/>
+            </w:pPr>
+            <w:r>
+              <w:t xml:space="preserve">Done</w:t>
+            </w:r>
+          </w:p>
+        </w:tc>
+      </w:tr>
+      <w:tr>
+        <w:tc>
+          <w:tcPr/>
+          <w:p>
+            <w:pPr>
+              <w:pStyle w:val="Compact"/>
+            </w:pPr>
+            <w:r>
+              <w:t xml:space="preserve">Justice Counts Implementation Program</w:t>
+            </w:r>
+          </w:p>
+        </w:tc>
+        <w:tc>
+          <w:tcPr/>
+          <w:p>
+            <w:pPr>
+              <w:pStyle w:val="Compact"/>
+            </w:pPr>
+          </w:p>
+        </w:tc>
+        <w:tc>
+          <w:tcPr/>
+          <w:p>
+            <w:pPr>
+              <w:pStyle w:val="Compact"/>
+            </w:pPr>
+          </w:p>
+        </w:tc>
+        <w:tc>
+          <w:tcPr/>
+          <w:p>
+            <w:pPr>
+              <w:pStyle w:val="Compact"/>
+            </w:pPr>
+            <w:r>
+              <w:t xml:space="preserve">☐</w:t>
+            </w:r>
+          </w:p>
+        </w:tc>
+      </w:tr>
+      <w:tr>
+        <w:tc>
+          <w:tcPr/>
+          <w:p>
+            <w:pPr>
+              <w:pStyle w:val="Compact"/>
+            </w:pPr>
+            <w:r>
+              <w:t xml:space="preserve">Restore, Reinvest, Renew (R3)</w:t>
+            </w:r>
+          </w:p>
+        </w:tc>
+        <w:tc>
+          <w:tcPr/>
+          <w:p>
+            <w:pPr>
+              <w:pStyle w:val="Compact"/>
+            </w:pPr>
+          </w:p>
+        </w:tc>
+        <w:tc>
+          <w:tcPr/>
+          <w:p>
+            <w:pPr>
+              <w:pStyle w:val="Compact"/>
+            </w:pPr>
+          </w:p>
+        </w:tc>
+        <w:tc>
+          <w:tcPr/>
+          <w:p>
+            <w:pPr>
+              <w:pStyle w:val="Compact"/>
+            </w:pPr>
+            <w:r>
+              <w:t xml:space="preserve">☐</w:t>
+            </w:r>
+          </w:p>
+        </w:tc>
+      </w:tr>
+      <w:tr>
+        <w:tc>
+          <w:tcPr/>
+          <w:p>
+            <w:pPr>
+              <w:pStyle w:val="Compact"/>
+            </w:pPr>
+            <w:r>
+              <w:t xml:space="preserve">Deaths in Custody</w:t>
+            </w:r>
+          </w:p>
+        </w:tc>
+        <w:tc>
+          <w:tcPr/>
+          <w:p>
+            <w:pPr>
+              <w:pStyle w:val="Compact"/>
+            </w:pPr>
+          </w:p>
+        </w:tc>
+        <w:tc>
+          <w:tcPr/>
+          <w:p>
+            <w:pPr>
+              <w:pStyle w:val="Compact"/>
+            </w:pPr>
+          </w:p>
+        </w:tc>
+        <w:tc>
+          <w:tcPr/>
+          <w:p>
+            <w:pPr>
+              <w:pStyle w:val="Compact"/>
+            </w:pPr>
+            <w:r>
+              <w:t xml:space="preserve">☐</w:t>
+            </w:r>
+          </w:p>
+        </w:tc>
+      </w:tr>
+      <w:tr>
+        <w:tc>
+          <w:tcPr/>
+          <w:p>
+            <w:pPr>
+              <w:pStyle w:val="Compact"/>
+            </w:pPr>
+            <w:r>
+              <w:t xml:space="preserve">Illinois Uniform Crime Report</w:t>
+            </w:r>
+          </w:p>
+        </w:tc>
+        <w:tc>
+          <w:tcPr/>
+          <w:p>
+            <w:pPr>
+              <w:pStyle w:val="Compact"/>
+            </w:pPr>
+          </w:p>
+        </w:tc>
+        <w:tc>
+          <w:tcPr/>
+          <w:p>
+            <w:pPr>
+              <w:pStyle w:val="Compact"/>
+            </w:pPr>
+          </w:p>
+        </w:tc>
+        <w:tc>
+          <w:tcPr/>
+          <w:p>
+            <w:pPr>
+              <w:pStyle w:val="Compact"/>
+            </w:pPr>
+            <w:r>
+              <w:t xml:space="preserve">☐</w:t>
+            </w:r>
+          </w:p>
+        </w:tc>
+      </w:tr>
+      <w:tr>
+        <w:tc>
+          <w:tcPr/>
+          <w:p>
+            <w:pPr>
+              <w:pStyle w:val="Compact"/>
+            </w:pPr>
+            <w:r>
+              <w:t xml:space="preserve">Violence Prevention Research</w:t>
+            </w:r>
+          </w:p>
+        </w:tc>
+        <w:tc>
+          <w:tcPr/>
+          <w:p>
+            <w:pPr>
+              <w:pStyle w:val="Compact"/>
+            </w:pPr>
+          </w:p>
+        </w:tc>
+        <w:tc>
+          <w:tcPr/>
+          <w:p>
+            <w:pPr>
+              <w:pStyle w:val="Compact"/>
+            </w:pPr>
+          </w:p>
+        </w:tc>
+        <w:tc>
+          <w:tcPr/>
+          <w:p>
+            <w:pPr>
+              <w:pStyle w:val="Compact"/>
+            </w:pPr>
+            <w:r>
+              <w:t xml:space="preserve">☐</w:t>
+            </w:r>
+          </w:p>
+        </w:tc>
+      </w:tr>
+    </w:tbl>
+    <w:bookmarkEnd w:id="16"/>
+    <w:bookmarkStart w:id="17" w:name="Xf7831d0a9e27798bbda4cea16e8635f146a05bc"/>
     <w:p>
       <w:pPr>
-        <w:pStyle w:val="Compact"/>
-        <w:numPr>
-          <w:ilvl w:val="1"/>
-          <w:numId w:val="1011"/>
-        </w:numPr>
-      </w:pPr>
+        <w:pStyle w:val="Heading3"/>
+      </w:pPr>
+      <w:r>
+        <w:t xml:space="preserve">2e. Article</w:t>
+      </w:r>
+      <w:r>
+        <w:t xml:space="preserve"> </w:t>
+      </w:r>
+      <w:r>
+        <w:t xml:space="preserve">“Related Content”</w:t>
+      </w:r>
+      <w:r>
+        <w:t xml:space="preserve"> </w:t>
+      </w:r>
+      <w:r>
+        <w:t xml:space="preserve">links —</w:t>
+      </w:r>
+      <w:r>
+        <w:t xml:space="preserve"> </w:t>
+      </w:r>
       <w:r>
         <w:rPr>
           <w:i/>
           <w:iCs/>
         </w:rPr>
-        <w:t xml:space="preserve">Technical step first:</w:t>
-      </w:r>
-      <w:r>
-        <w:t xml:space="preserve"> </w:t>
-      </w:r>
-      <w:r>
-        <w:t xml:space="preserve">add a link between centers and articles.</w:t>
-      </w:r>
-      <w:r>
-        <w:t xml:space="preserve"> </w:t>
-      </w:r>
-      <w:r>
-        <w:rPr>
-          <w:i/>
-          <w:iCs/>
-        </w:rPr>
-        <w:t xml:space="preserve">Then:</w:t>
-      </w:r>
-      <w:r>
-        <w:t xml:space="preserve"> </w:t>
-      </w:r>
-      <w:r>
-        <w:t xml:space="preserve">tag each article with</w:t>
-      </w:r>
-      <w:r>
-        <w:t xml:space="preserve"> </w:t>
-      </w:r>
-      <w:r>
-        <w:t xml:space="preserve">its center.</w:t>
+        <w:t xml:space="preserve">setup: field on Article</w:t>
       </w:r>
     </w:p>
     <w:p>
       <w:pPr>
-        <w:pStyle w:val="Compact"/>
-        <w:numPr>
-          <w:ilvl w:val="1"/>
-          <w:numId w:val="1011"/>
-        </w:numPr>
-      </w:pPr>
-      <w:r>
-        <w:t xml:space="preserve">This turns on the design’s</w:t>
-      </w:r>
-      <w:r>
-        <w:t xml:space="preserve"> </w:t>
-      </w:r>
-      <w:r>
-        <w:rPr>
-          <w:b/>
-          <w:bCs/>
-        </w:rPr>
-        <w:t xml:space="preserve">“All Centers”</w:t>
-      </w:r>
-      <w:r>
-        <w:rPr>
-          <w:b/>
-          <w:bCs/>
-        </w:rPr>
-        <w:t xml:space="preserve"> </w:t>
-      </w:r>
-      <w:r>
-        <w:rPr>
-          <w:b/>
-          <w:bCs/>
-        </w:rPr>
-        <w:t xml:space="preserve">filter</w:t>
-      </w:r>
-      <w:r>
-        <w:t xml:space="preserve"> </w:t>
-      </w:r>
-      <w:r>
-        <w:t xml:space="preserve">on the Articles page. (Right now a center is</w:t>
-      </w:r>
-      <w:r>
-        <w:t xml:space="preserve"> </w:t>
-      </w:r>
-      <w:r>
-        <w:t xml:space="preserve">only implied by the author’s name.)</w:t>
+        <w:pStyle w:val="FirstParagraph"/>
+      </w:pPr>
+      <w:r>
+        <w:t xml:space="preserve">An optional place to add hand-picked external links on an article. Populate where useful (related apps</w:t>
+      </w:r>
+      <w:r>
+        <w:t xml:space="preserve"> </w:t>
+      </w:r>
+      <w:r>
+        <w:t xml:space="preserve">and datasets already appear automatically when they are linked).</w:t>
       </w:r>
     </w:p>
-    <w:p>
-      <w:pPr>
-        <w:pStyle w:val="Compact"/>
-        <w:numPr>
-          <w:ilvl w:val="0"/>
-          <w:numId w:val="1012"/>
-        </w:numPr>
-      </w:pPr>
-      <w:r>
-        <w:rPr>
-          <w:b/>
-          <w:bCs/>
-        </w:rPr>
-        <w:t xml:space="preserve">Related Publications &amp; Related Resources on project pages</w:t>
-      </w:r>
-      <w:r>
-        <w:t xml:space="preserve"> </w:t>
-      </w:r>
-      <w:r>
-        <w:t xml:space="preserve">— link each project to its related</w:t>
-      </w:r>
-      <w:r>
-        <w:t xml:space="preserve"> </w:t>
-      </w:r>
-      <w:r>
-        <w:t xml:space="preserve">publications and downloadable resources.</w:t>
-      </w:r>
-    </w:p>
-    <w:p>
-      <w:pPr>
-        <w:pStyle w:val="Compact"/>
-        <w:numPr>
-          <w:ilvl w:val="1"/>
-          <w:numId w:val="1013"/>
-        </w:numPr>
-      </w:pPr>
-      <w:r>
-        <w:rPr>
-          <w:i/>
-          <w:iCs/>
-        </w:rPr>
-        <w:t xml:space="preserve">Technical step first:</w:t>
-      </w:r>
-      <w:r>
-        <w:t xml:space="preserve"> </w:t>
-      </w:r>
-      <w:r>
-        <w:t xml:space="preserve">add the links/fields.</w:t>
-      </w:r>
-      <w:r>
-        <w:t xml:space="preserve"> </w:t>
-      </w:r>
-      <w:r>
-        <w:rPr>
-          <w:i/>
-          <w:iCs/>
-        </w:rPr>
-        <w:t xml:space="preserve">Then:</w:t>
-      </w:r>
-      <w:r>
-        <w:t xml:space="preserve"> </w:t>
-      </w:r>
-      <w:r>
-        <w:t xml:space="preserve">fill them in per project.</w:t>
-      </w:r>
-    </w:p>
-    <w:p>
-      <w:pPr>
-        <w:pStyle w:val="Compact"/>
-        <w:numPr>
-          <w:ilvl w:val="0"/>
-          <w:numId w:val="1014"/>
-        </w:numPr>
-      </w:pPr>
-      <w:r>
-        <w:rPr>
-          <w:b/>
-          <w:bCs/>
-        </w:rPr>
-        <w:t xml:space="preserve">Article</w:t>
-      </w:r>
-      <w:r>
-        <w:rPr>
-          <w:b/>
-          <w:bCs/>
-        </w:rPr>
-        <w:t xml:space="preserve"> </w:t>
-      </w:r>
-      <w:r>
-        <w:rPr>
-          <w:b/>
-          <w:bCs/>
-        </w:rPr>
-        <w:t xml:space="preserve">“Related Content”</w:t>
-      </w:r>
-      <w:r>
-        <w:rPr>
-          <w:b/>
-          <w:bCs/>
-        </w:rPr>
-        <w:t xml:space="preserve"> </w:t>
-      </w:r>
-      <w:r>
-        <w:rPr>
-          <w:b/>
-          <w:bCs/>
-        </w:rPr>
-        <w:t xml:space="preserve">links</w:t>
-      </w:r>
-      <w:r>
-        <w:t xml:space="preserve"> </w:t>
-      </w:r>
-      <w:r>
-        <w:t xml:space="preserve">— a place to add hand-picked external links on an article.</w:t>
-      </w:r>
-    </w:p>
-    <w:p>
-      <w:pPr>
-        <w:pStyle w:val="Compact"/>
-        <w:numPr>
-          <w:ilvl w:val="1"/>
-          <w:numId w:val="1015"/>
-        </w:numPr>
-      </w:pPr>
-      <w:r>
-        <w:rPr>
-          <w:i/>
-          <w:iCs/>
-        </w:rPr>
-        <w:t xml:space="preserve">Technical step first:</w:t>
-      </w:r>
-      <w:r>
-        <w:t xml:space="preserve"> </w:t>
-      </w:r>
-      <w:r>
-        <w:t xml:space="preserve">add the field.</w:t>
-      </w:r>
-      <w:r>
-        <w:t xml:space="preserve"> </w:t>
-      </w:r>
-      <w:r>
-        <w:rPr>
-          <w:i/>
-          <w:iCs/>
-        </w:rPr>
-        <w:t xml:space="preserve">Then:</w:t>
-      </w:r>
-      <w:r>
-        <w:t xml:space="preserve"> </w:t>
-      </w:r>
-      <w:r>
-        <w:t xml:space="preserve">fill it in where useful.</w:t>
-      </w:r>
-    </w:p>
-    <w:p>
-      <w:pPr>
-        <w:pStyle w:val="Compact"/>
-        <w:numPr>
-          <w:ilvl w:val="1"/>
-          <w:numId w:val="1015"/>
-        </w:numPr>
-      </w:pPr>
-      <w:r>
-        <w:t xml:space="preserve">(Related apps and datasets already appear automatically when they are linked.)</w:t>
-      </w:r>
-    </w:p>
+    <w:tbl>
+      <w:tblPr>
+        <w:tblStyle w:val="Table"/>
+        <w:tblW w:type="auto" w:w="0"/>
+        <w:tblLook w:firstRow="1" w:lastRow="0" w:firstColumn="0" w:lastColumn="0" w:noHBand="0" w:noVBand="0" w:val="0020"/>
+      </w:tblPr>
+      <w:tblGrid>
+        <w:gridCol w:w="1980"/>
+        <w:gridCol w:w="1980"/>
+        <w:gridCol w:w="1980"/>
+        <w:gridCol w:w="1980"/>
+      </w:tblGrid>
+      <w:tr>
+        <w:trPr>
+          <w:tblHeader w:val="on"/>
+        </w:trPr>
+        <w:tc>
+          <w:tcPr/>
+          <w:p>
+            <w:pPr>
+              <w:pStyle w:val="Compact"/>
+            </w:pPr>
+            <w:r>
+              <w:t xml:space="preserve">Task</w:t>
+            </w:r>
+          </w:p>
+        </w:tc>
+        <w:tc>
+          <w:tcPr/>
+          <w:p>
+            <w:pPr>
+              <w:pStyle w:val="Compact"/>
+            </w:pPr>
+            <w:r>
+              <w:t xml:space="preserve">Owner</w:t>
+            </w:r>
+          </w:p>
+        </w:tc>
+        <w:tc>
+          <w:tcPr/>
+          <w:p>
+            <w:pPr>
+              <w:pStyle w:val="Compact"/>
+            </w:pPr>
+            <w:r>
+              <w:t xml:space="preserve">Target</w:t>
+            </w:r>
+          </w:p>
+        </w:tc>
+        <w:tc>
+          <w:tcPr/>
+          <w:p>
+            <w:pPr>
+              <w:pStyle w:val="Compact"/>
+            </w:pPr>
+            <w:r>
+              <w:t xml:space="preserve">Done</w:t>
+            </w:r>
+          </w:p>
+        </w:tc>
+      </w:tr>
+      <w:tr>
+        <w:tc>
+          <w:tcPr/>
+          <w:p>
+            <w:pPr>
+              <w:pStyle w:val="Compact"/>
+            </w:pPr>
+            <w:r>
+              <w:t xml:space="preserve">Add</w:t>
+            </w:r>
+            <w:r>
+              <w:t xml:space="preserve"> </w:t>
+            </w:r>
+            <w:r>
+              <w:t xml:space="preserve">“Related Content”</w:t>
+            </w:r>
+            <w:r>
+              <w:t xml:space="preserve"> </w:t>
+            </w:r>
+            <w:r>
+              <w:t xml:space="preserve">links where useful (as needed)</w:t>
+            </w:r>
+          </w:p>
+        </w:tc>
+        <w:tc>
+          <w:tcPr/>
+          <w:p>
+            <w:pPr>
+              <w:pStyle w:val="Compact"/>
+            </w:pPr>
+          </w:p>
+        </w:tc>
+        <w:tc>
+          <w:tcPr/>
+          <w:p>
+            <w:pPr>
+              <w:pStyle w:val="Compact"/>
+            </w:pPr>
+          </w:p>
+        </w:tc>
+        <w:tc>
+          <w:tcPr/>
+          <w:p>
+            <w:pPr>
+              <w:pStyle w:val="Compact"/>
+            </w:pPr>
+            <w:r>
+              <w:t xml:space="preserve">☐</w:t>
+            </w:r>
+          </w:p>
+        </w:tc>
+      </w:tr>
+    </w:tbl>
     <w:p>
       <w:r>
         <w:pict>
@@ -880,44 +2148,120 @@
         </w:pict>
       </w:r>
     </w:p>
-    <w:bookmarkEnd w:id="11"/>
-    <w:bookmarkStart w:id="12" w:name="Xee2dd545e505c255aa9260eaf8b260f1be0bfae"/>
+    <w:bookmarkEnd w:id="17"/>
+    <w:bookmarkEnd w:id="18"/>
+    <w:bookmarkStart w:id="19" w:name="Xec0b683237f0dc3faa3f5da44abd5a0443e9649"/>
     <w:p>
       <w:pPr>
         <w:pStyle w:val="Heading2"/>
       </w:pPr>
       <w:r>
-        <w:t xml:space="preserve">3. At go-live — a content sync</w:t>
+        <w:t xml:space="preserve">3. At go-live — content sync</w:t>
       </w:r>
     </w:p>
-    <w:p>
-      <w:pPr>
-        <w:pStyle w:val="Compact"/>
-        <w:numPr>
-          <w:ilvl w:val="0"/>
-          <w:numId w:val="1016"/>
-        </w:numPr>
-      </w:pPr>
-      <w:r>
-        <w:rPr>
-          <w:b/>
-          <w:bCs/>
-        </w:rPr>
-        <w:t xml:space="preserve">Bring over newer articles</w:t>
-      </w:r>
-      <w:r>
-        <w:t xml:space="preserve"> </w:t>
-      </w:r>
-      <w:r>
-        <w:t xml:space="preserve">— pull in any articles published on the current live Hub since this</w:t>
-      </w:r>
-      <w:r>
-        <w:t xml:space="preserve"> </w:t>
-      </w:r>
-      <w:r>
-        <w:t xml:space="preserve">draft was built, so nothing is missed at the switch-over.</w:t>
-      </w:r>
-    </w:p>
+    <w:tbl>
+      <w:tblPr>
+        <w:tblStyle w:val="Table"/>
+        <w:tblW w:type="pct" w:w="5000"/>
+        <w:tblLayout w:type="fixed"/>
+        <w:tblLook w:firstRow="1" w:lastRow="0" w:firstColumn="0" w:lastColumn="0" w:noHBand="0" w:noVBand="0" w:val="0020"/>
+      </w:tblPr>
+      <w:tblGrid>
+        <w:gridCol w:w="1980"/>
+        <w:gridCol w:w="1980"/>
+        <w:gridCol w:w="1980"/>
+        <w:gridCol w:w="1980"/>
+      </w:tblGrid>
+      <w:tr>
+        <w:trPr>
+          <w:tblHeader w:val="on"/>
+        </w:trPr>
+        <w:tc>
+          <w:tcPr/>
+          <w:p>
+            <w:pPr>
+              <w:pStyle w:val="Compact"/>
+            </w:pPr>
+            <w:r>
+              <w:t xml:space="preserve">Task</w:t>
+            </w:r>
+          </w:p>
+        </w:tc>
+        <w:tc>
+          <w:tcPr/>
+          <w:p>
+            <w:pPr>
+              <w:pStyle w:val="Compact"/>
+            </w:pPr>
+            <w:r>
+              <w:t xml:space="preserve">Owner</w:t>
+            </w:r>
+          </w:p>
+        </w:tc>
+        <w:tc>
+          <w:tcPr/>
+          <w:p>
+            <w:pPr>
+              <w:pStyle w:val="Compact"/>
+            </w:pPr>
+            <w:r>
+              <w:t xml:space="preserve">Target</w:t>
+            </w:r>
+          </w:p>
+        </w:tc>
+        <w:tc>
+          <w:tcPr/>
+          <w:p>
+            <w:pPr>
+              <w:pStyle w:val="Compact"/>
+            </w:pPr>
+            <w:r>
+              <w:t xml:space="preserve">Done</w:t>
+            </w:r>
+          </w:p>
+        </w:tc>
+      </w:tr>
+      <w:tr>
+        <w:tc>
+          <w:tcPr/>
+          <w:p>
+            <w:pPr>
+              <w:pStyle w:val="Compact"/>
+            </w:pPr>
+            <w:r>
+              <w:t xml:space="preserve">Bring over any articles published on the live Hub since this draft was built</w:t>
+            </w:r>
+          </w:p>
+        </w:tc>
+        <w:tc>
+          <w:tcPr/>
+          <w:p>
+            <w:pPr>
+              <w:pStyle w:val="Compact"/>
+            </w:pPr>
+          </w:p>
+        </w:tc>
+        <w:tc>
+          <w:tcPr/>
+          <w:p>
+            <w:pPr>
+              <w:pStyle w:val="Compact"/>
+            </w:pPr>
+          </w:p>
+        </w:tc>
+        <w:tc>
+          <w:tcPr/>
+          <w:p>
+            <w:pPr>
+              <w:pStyle w:val="Compact"/>
+            </w:pPr>
+            <w:r>
+              <w:t xml:space="preserve">☐</w:t>
+            </w:r>
+          </w:p>
+        </w:tc>
+      </w:tr>
+    </w:tbl>
     <w:p>
       <w:r>
         <w:pict>
@@ -925,8 +2269,8 @@
         </w:pict>
       </w:r>
     </w:p>
-    <w:bookmarkEnd w:id="12"/>
-    <w:bookmarkStart w:id="13" w:name="Xf0e8976476a6ef5f875ed2b158dcb786dbddafa"/>
+    <w:bookmarkEnd w:id="19"/>
+    <w:bookmarkStart w:id="20" w:name="Xf0e8976476a6ef5f875ed2b158dcb786dbddafa"/>
     <w:p>
       <w:pPr>
         <w:pStyle w:val="Heading2"/>
@@ -956,19 +2300,19 @@
         <w:t xml:space="preserve"> </w:t>
       </w:r>
       <w:r>
-        <w:t xml:space="preserve">content and are tracked on the roadmap, listed here only so</w:t>
-      </w:r>
-      <w:r>
-        <w:t xml:space="preserve"> </w:t>
-      </w:r>
-      <w:r>
-        <w:t xml:space="preserve">the picture is complete: design sign-off, a live screen-reader accessibility session, the main-site</w:t>
-      </w:r>
-      <w:r>
-        <w:t xml:space="preserve"> </w:t>
-      </w:r>
-      <w:r>
-        <w:t xml:space="preserve">address switch-over (so</w:t>
+        <w:t xml:space="preserve">content and are tracked on the roadmap, listed only so the</w:t>
+      </w:r>
+      <w:r>
+        <w:t xml:space="preserve"> </w:t>
+      </w:r>
+      <w:r>
+        <w:t xml:space="preserve">picture is complete: design sign-off, a live screen-reader accessibility session, the main-site address</w:t>
+      </w:r>
+      <w:r>
+        <w:t xml:space="preserve"> </w:t>
+      </w:r>
+      <w:r>
+        <w:t xml:space="preserve">switch-over (so</w:t>
       </w:r>
       <w:r>
         <w:t xml:space="preserve"> </w:t>
@@ -983,19 +2327,13 @@
         <w:t xml:space="preserve"> </w:t>
       </w:r>
       <w:r>
-        <w:t xml:space="preserve">points at the new site), and the</w:t>
-      </w:r>
-      <w:r>
-        <w:t xml:space="preserve"> </w:t>
-      </w:r>
-      <w:r>
-        <w:t xml:space="preserve">search-engine settings flipped on at go-live. Separately, two obsolete internal content types</w:t>
-      </w:r>
-      <w:r>
-        <w:t xml:space="preserve"> </w:t>
-      </w:r>
-      <w:r>
-        <w:t xml:space="preserve">(</w:t>
+        <w:t xml:space="preserve">points at the new site), and the search-engine</w:t>
+      </w:r>
+      <w:r>
+        <w:t xml:space="preserve"> </w:t>
+      </w:r>
+      <w:r>
+        <w:t xml:space="preserve">settings turned on at go-live. Two obsolete internal content types (</w:t>
       </w:r>
       <w:r>
         <w:rPr>
@@ -1016,7 +2354,13 @@
         <w:t xml:space="preserve">projecthome</w:t>
       </w:r>
       <w:r>
-        <w:t xml:space="preserve">) are scheduled for removal after July 31, 2026.</w:t>
+        <w:t xml:space="preserve">) are</w:t>
+      </w:r>
+      <w:r>
+        <w:t xml:space="preserve"> </w:t>
+      </w:r>
+      <w:r>
+        <w:t xml:space="preserve">scheduled for removal after July 31, 2026.</w:t>
       </w:r>
     </w:p>
     <w:p>
@@ -1035,7 +2379,7 @@
           <w:i/>
           <w:iCs/>
         </w:rPr>
-        <w:t xml:space="preserve">Need any row broken down further — e.g., a line per center, per project, or per dataset — or an</w:t>
+        <w:t xml:space="preserve">Project, center, and dataset names are pulled from the live content system as of July 16, 2026. Want</w:t>
       </w:r>
       <w:r>
         <w:rPr>
@@ -1049,10 +2393,24 @@
           <w:i/>
           <w:iCs/>
         </w:rPr>
-        <w:t xml:space="preserve">owner and target date added to each? The development team can expand this into a working tracker.</w:t>
+        <w:t xml:space="preserve">Owner and Target pre-filled, or the ~236-article tagging pass split into assignable batches? The</w:t>
+      </w:r>
+      <w:r>
+        <w:rPr>
+          <w:i/>
+          <w:iCs/>
+        </w:rPr>
+        <w:t xml:space="preserve"> </w:t>
+      </w:r>
+      <w:r>
+        <w:rPr>
+          <w:i/>
+          <w:iCs/>
+        </w:rPr>
+        <w:t xml:space="preserve">development team can adjust this tracker.</w:t>
       </w:r>
     </w:p>
-    <w:bookmarkEnd w:id="13"/>
+    <w:bookmarkEnd w:id="20"/>
     <w:sectPr>
       <w:footnotePr>
         <w:numRestart w:val="eachSect"/>
@@ -1266,132 +2624,11 @@
       </w:rPr>
     </w:lvl>
   </w:abstractNum>
-  <w:abstractNum w:abstractNumId="992">
-    <w:nsid w:val="0000A992"/>
-    <w:multiLevelType w:val="multilevel"/>
-    <w:lvl w:ilvl="0">
-      <w:numFmt w:val="bullet"/>
-      <w:lvlText w:val="☐"/>
-      <w:lvlJc w:val="left"/>
-      <w:pPr>
-        <w:ind w:left="720" w:hanging="360"/>
-      </w:pPr>
-    </w:lvl>
-    <w:lvl w:ilvl="1">
-      <w:numFmt w:val="bullet"/>
-      <w:lvlText w:val="☐"/>
-      <w:lvlJc w:val="left"/>
-      <w:pPr>
-        <w:ind w:left="1440" w:hanging="360"/>
-      </w:pPr>
-    </w:lvl>
-    <w:lvl w:ilvl="2">
-      <w:numFmt w:val="bullet"/>
-      <w:lvlText w:val="☐"/>
-      <w:lvlJc w:val="left"/>
-      <w:pPr>
-        <w:ind w:left="2160" w:hanging="360"/>
-      </w:pPr>
-    </w:lvl>
-    <w:lvl w:ilvl="3">
-      <w:numFmt w:val="bullet"/>
-      <w:lvlText w:val="☐"/>
-      <w:lvlJc w:val="left"/>
-      <w:pPr>
-        <w:ind w:left="2880" w:hanging="360"/>
-      </w:pPr>
-    </w:lvl>
-    <w:lvl w:ilvl="4">
-      <w:numFmt w:val="bullet"/>
-      <w:lvlText w:val="☐"/>
-      <w:lvlJc w:val="left"/>
-      <w:pPr>
-        <w:ind w:left="3600" w:hanging="360"/>
-      </w:pPr>
-    </w:lvl>
-    <w:lvl w:ilvl="5">
-      <w:numFmt w:val="bullet"/>
-      <w:lvlText w:val="☐"/>
-      <w:lvlJc w:val="left"/>
-      <w:pPr>
-        <w:ind w:left="4320" w:hanging="360"/>
-      </w:pPr>
-    </w:lvl>
-    <w:lvl w:ilvl="6">
-      <w:numFmt w:val="bullet"/>
-      <w:lvlText w:val="☐"/>
-      <w:lvlJc w:val="left"/>
-      <w:pPr>
-        <w:ind w:left="5040" w:hanging="360"/>
-      </w:pPr>
-    </w:lvl>
-    <w:lvl w:ilvl="7">
-      <w:numFmt w:val="bullet"/>
-      <w:lvlText w:val="☐"/>
-      <w:lvlJc w:val="left"/>
-      <w:pPr>
-        <w:ind w:left="5760" w:hanging="360"/>
-      </w:pPr>
-    </w:lvl>
-    <w:lvl w:ilvl="8">
-      <w:numFmt w:val="bullet"/>
-      <w:lvlText w:val="☐"/>
-      <w:lvlJc w:val="left"/>
-      <w:pPr>
-        <w:ind w:left="6480" w:hanging="360"/>
-      </w:pPr>
-    </w:lvl>
-  </w:abstractNum>
   <w:num w:numId="1000">
     <w:abstractNumId w:val="990"/>
   </w:num>
   <w:num w:numId="1001">
     <w:abstractNumId w:val="991"/>
-  </w:num>
-  <w:num w:numId="1002">
-    <w:abstractNumId w:val="992"/>
-  </w:num>
-  <w:num w:numId="1003">
-    <w:abstractNumId w:val="991"/>
-  </w:num>
-  <w:num w:numId="1004">
-    <w:abstractNumId w:val="992"/>
-  </w:num>
-  <w:num w:numId="1005">
-    <w:abstractNumId w:val="991"/>
-  </w:num>
-  <w:num w:numId="1006">
-    <w:abstractNumId w:val="992"/>
-  </w:num>
-  <w:num w:numId="1007">
-    <w:abstractNumId w:val="991"/>
-  </w:num>
-  <w:num w:numId="1008">
-    <w:abstractNumId w:val="992"/>
-  </w:num>
-  <w:num w:numId="1009">
-    <w:abstractNumId w:val="991"/>
-  </w:num>
-  <w:num w:numId="1010">
-    <w:abstractNumId w:val="992"/>
-  </w:num>
-  <w:num w:numId="1011">
-    <w:abstractNumId w:val="991"/>
-  </w:num>
-  <w:num w:numId="1012">
-    <w:abstractNumId w:val="992"/>
-  </w:num>
-  <w:num w:numId="1013">
-    <w:abstractNumId w:val="991"/>
-  </w:num>
-  <w:num w:numId="1014">
-    <w:abstractNumId w:val="992"/>
-  </w:num>
-  <w:num w:numId="1015">
-    <w:abstractNumId w:val="991"/>
-  </w:num>
-  <w:num w:numId="1016">
-    <w:abstractNumId w:val="992"/>
   </w:num>
 </w:numbering>
 </file>

</xml_diff>

<commit_message>
docs: set content-tracker owner to R&A staff
Pre-fill the Owner column as 'R&A staff' on every content item so the
Research & Analysis unit sees the work is theirs (specific names swapped in
when assigned). The one-time technical setups remain flagged as the dev
team's. Target/Done left blank for R&A to fill.
</commit_message>
<xml_diff>
--- a/docs/ICJIA-Research-Hub-content-checklist.docx
+++ b/docs/ICJIA-Research-Hub-content-checklist.docx
@@ -98,7 +98,7 @@
         <w:t xml:space="preserve"> </w:t>
       </w:r>
       <w:r>
-        <w:t xml:space="preserve">so the work can be assigned and tracked. Fill in</w:t>
+        <w:t xml:space="preserve">so the work can be assigned and tracked. Every content item is owned by the</w:t>
       </w:r>
       <w:r>
         <w:t xml:space="preserve"> </w:t>
@@ -108,13 +108,46 @@
           <w:b/>
           <w:bCs/>
         </w:rPr>
-        <w:t xml:space="preserve">Owner</w:t>
-      </w:r>
-      <w:r>
-        <w:t xml:space="preserve"> </w:t>
-      </w:r>
-      <w:r>
-        <w:t xml:space="preserve">and</w:t>
+        <w:t xml:space="preserve">R&amp;A (Research &amp; Analysis)</w:t>
+      </w:r>
+      <w:r>
+        <w:rPr>
+          <w:b/>
+          <w:bCs/>
+        </w:rPr>
+        <w:t xml:space="preserve"> </w:t>
+      </w:r>
+      <w:r>
+        <w:rPr>
+          <w:b/>
+          <w:bCs/>
+        </w:rPr>
+        <w:t xml:space="preserve">unit</w:t>
+      </w:r>
+      <w:r>
+        <w:t xml:space="preserve">: the Owner column is pre-set to</w:t>
+      </w:r>
+      <w:r>
+        <w:t xml:space="preserve"> </w:t>
+      </w:r>
+      <w:r>
+        <w:rPr>
+          <w:i/>
+          <w:iCs/>
+        </w:rPr>
+        <w:t xml:space="preserve">R&amp;A staff</w:t>
+      </w:r>
+      <w:r>
+        <w:t xml:space="preserve"> </w:t>
+      </w:r>
+      <w:r>
+        <w:t xml:space="preserve">— replace it with a specific name once assigned. Fill</w:t>
+      </w:r>
+      <w:r>
+        <w:t xml:space="preserve"> </w:t>
+      </w:r>
+      <w:r>
+        <w:t xml:space="preserve">in</w:t>
       </w:r>
       <w:r>
         <w:t xml:space="preserve"> </w:t>
@@ -130,7 +163,7 @@
         <w:t xml:space="preserve"> </w:t>
       </w:r>
       <w:r>
-        <w:t xml:space="preserve">as you go, and mark</w:t>
+        <w:t xml:space="preserve">dates and mark</w:t>
       </w:r>
       <w:r>
         <w:t xml:space="preserve"> </w:t>
@@ -146,7 +179,13 @@
         <w:t xml:space="preserve"> </w:t>
       </w:r>
       <w:r>
-        <w:t xml:space="preserve">(change ☐ to ☒) when each item is complete.</w:t>
+        <w:t xml:space="preserve">(change ☐ to ☒) as work completes. (The one-time technical setups</w:t>
+      </w:r>
+      <w:r>
+        <w:t xml:space="preserve"> </w:t>
+      </w:r>
+      <w:r>
+        <w:t xml:space="preserve">listed below are the development team’s, not R&amp;A’s.)</w:t>
       </w:r>
     </w:p>
     <w:p>
@@ -499,6 +538,9 @@
             <w:pPr>
               <w:pStyle w:val="Compact"/>
             </w:pPr>
+            <w:r>
+              <w:t xml:space="preserve">R&amp;A staff</w:t>
+            </w:r>
           </w:p>
         </w:tc>
         <w:tc>
@@ -545,6 +587,9 @@
             <w:pPr>
               <w:pStyle w:val="Compact"/>
             </w:pPr>
+            <w:r>
+              <w:t xml:space="preserve">R&amp;A staff</w:t>
+            </w:r>
           </w:p>
         </w:tc>
         <w:tc>
@@ -585,6 +630,9 @@
             <w:pPr>
               <w:pStyle w:val="Compact"/>
             </w:pPr>
+            <w:r>
+              <w:t xml:space="preserve">R&amp;A staff</w:t>
+            </w:r>
           </w:p>
         </w:tc>
         <w:tc>
@@ -705,6 +753,9 @@
             <w:pPr>
               <w:pStyle w:val="Compact"/>
             </w:pPr>
+            <w:r>
+              <w:t xml:space="preserve">R&amp;A staff</w:t>
+            </w:r>
           </w:p>
         </w:tc>
         <w:tc>
@@ -745,6 +796,9 @@
             <w:pPr>
               <w:pStyle w:val="Compact"/>
             </w:pPr>
+            <w:r>
+              <w:t xml:space="preserve">R&amp;A staff</w:t>
+            </w:r>
           </w:p>
         </w:tc>
         <w:tc>
@@ -785,6 +839,9 @@
             <w:pPr>
               <w:pStyle w:val="Compact"/>
             </w:pPr>
+            <w:r>
+              <w:t xml:space="preserve">R&amp;A staff</w:t>
+            </w:r>
           </w:p>
         </w:tc>
         <w:tc>
@@ -825,6 +882,9 @@
             <w:pPr>
               <w:pStyle w:val="Compact"/>
             </w:pPr>
+            <w:r>
+              <w:t xml:space="preserve">R&amp;A staff</w:t>
+            </w:r>
           </w:p>
         </w:tc>
         <w:tc>
@@ -865,6 +925,9 @@
             <w:pPr>
               <w:pStyle w:val="Compact"/>
             </w:pPr>
+            <w:r>
+              <w:t xml:space="preserve">R&amp;A staff</w:t>
+            </w:r>
           </w:p>
         </w:tc>
         <w:tc>
@@ -931,1232 +994,6 @@
       </w:pPr>
       <w:r>
         <w:t xml:space="preserve">One photo per research center (center pages have none today).</w:t>
-      </w:r>
-    </w:p>
-    <w:tbl>
-      <w:tblPr>
-        <w:tblStyle w:val="Table"/>
-        <w:tblW w:type="auto" w:w="0"/>
-        <w:tblLook w:firstRow="1" w:lastRow="0" w:firstColumn="0" w:lastColumn="0" w:noHBand="0" w:noVBand="0" w:val="0020"/>
-      </w:tblPr>
-      <w:tblGrid>
-        <w:gridCol w:w="1980"/>
-        <w:gridCol w:w="1980"/>
-        <w:gridCol w:w="1980"/>
-        <w:gridCol w:w="1980"/>
-      </w:tblGrid>
-      <w:tr>
-        <w:trPr>
-          <w:tblHeader w:val="on"/>
-        </w:trPr>
-        <w:tc>
-          <w:tcPr/>
-          <w:p>
-            <w:pPr>
-              <w:pStyle w:val="Compact"/>
-            </w:pPr>
-            <w:r>
-              <w:t xml:space="preserve">Center</w:t>
-            </w:r>
-          </w:p>
-        </w:tc>
-        <w:tc>
-          <w:tcPr/>
-          <w:p>
-            <w:pPr>
-              <w:pStyle w:val="Compact"/>
-            </w:pPr>
-            <w:r>
-              <w:t xml:space="preserve">Owner</w:t>
-            </w:r>
-          </w:p>
-        </w:tc>
-        <w:tc>
-          <w:tcPr/>
-          <w:p>
-            <w:pPr>
-              <w:pStyle w:val="Compact"/>
-            </w:pPr>
-            <w:r>
-              <w:t xml:space="preserve">Target</w:t>
-            </w:r>
-          </w:p>
-        </w:tc>
-        <w:tc>
-          <w:tcPr/>
-          <w:p>
-            <w:pPr>
-              <w:pStyle w:val="Compact"/>
-            </w:pPr>
-            <w:r>
-              <w:t xml:space="preserve">Done</w:t>
-            </w:r>
-          </w:p>
-        </w:tc>
-      </w:tr>
-      <w:tr>
-        <w:tc>
-          <w:tcPr/>
-          <w:p>
-            <w:pPr>
-              <w:pStyle w:val="Compact"/>
-            </w:pPr>
-            <w:r>
-              <w:t xml:space="preserve">Center for Community Corrections Research</w:t>
-            </w:r>
-          </w:p>
-        </w:tc>
-        <w:tc>
-          <w:tcPr/>
-          <w:p>
-            <w:pPr>
-              <w:pStyle w:val="Compact"/>
-            </w:pPr>
-          </w:p>
-        </w:tc>
-        <w:tc>
-          <w:tcPr/>
-          <w:p>
-            <w:pPr>
-              <w:pStyle w:val="Compact"/>
-            </w:pPr>
-          </w:p>
-        </w:tc>
-        <w:tc>
-          <w:tcPr/>
-          <w:p>
-            <w:pPr>
-              <w:pStyle w:val="Compact"/>
-            </w:pPr>
-            <w:r>
-              <w:t xml:space="preserve">☐</w:t>
-            </w:r>
-          </w:p>
-        </w:tc>
-      </w:tr>
-      <w:tr>
-        <w:tc>
-          <w:tcPr/>
-          <w:p>
-            <w:pPr>
-              <w:pStyle w:val="Compact"/>
-            </w:pPr>
-            <w:r>
-              <w:t xml:space="preserve">Center for Criminal Justice Data and Analytics</w:t>
-            </w:r>
-          </w:p>
-        </w:tc>
-        <w:tc>
-          <w:tcPr/>
-          <w:p>
-            <w:pPr>
-              <w:pStyle w:val="Compact"/>
-            </w:pPr>
-          </w:p>
-        </w:tc>
-        <w:tc>
-          <w:tcPr/>
-          <w:p>
-            <w:pPr>
-              <w:pStyle w:val="Compact"/>
-            </w:pPr>
-          </w:p>
-        </w:tc>
-        <w:tc>
-          <w:tcPr/>
-          <w:p>
-            <w:pPr>
-              <w:pStyle w:val="Compact"/>
-            </w:pPr>
-            <w:r>
-              <w:t xml:space="preserve">☐</w:t>
-            </w:r>
-          </w:p>
-        </w:tc>
-      </w:tr>
-      <w:tr>
-        <w:tc>
-          <w:tcPr/>
-          <w:p>
-            <w:pPr>
-              <w:pStyle w:val="Compact"/>
-            </w:pPr>
-            <w:r>
-              <w:t xml:space="preserve">Center for Justice Research and Evaluation</w:t>
-            </w:r>
-          </w:p>
-        </w:tc>
-        <w:tc>
-          <w:tcPr/>
-          <w:p>
-            <w:pPr>
-              <w:pStyle w:val="Compact"/>
-            </w:pPr>
-          </w:p>
-        </w:tc>
-        <w:tc>
-          <w:tcPr/>
-          <w:p>
-            <w:pPr>
-              <w:pStyle w:val="Compact"/>
-            </w:pPr>
-          </w:p>
-        </w:tc>
-        <w:tc>
-          <w:tcPr/>
-          <w:p>
-            <w:pPr>
-              <w:pStyle w:val="Compact"/>
-            </w:pPr>
-            <w:r>
-              <w:t xml:space="preserve">☐</w:t>
-            </w:r>
-          </w:p>
-        </w:tc>
-      </w:tr>
-      <w:tr>
-        <w:tc>
-          <w:tcPr/>
-          <w:p>
-            <w:pPr>
-              <w:pStyle w:val="Compact"/>
-            </w:pPr>
-            <w:r>
-              <w:t xml:space="preserve">Center for Sponsored Research &amp; Program Development</w:t>
-            </w:r>
-          </w:p>
-        </w:tc>
-        <w:tc>
-          <w:tcPr/>
-          <w:p>
-            <w:pPr>
-              <w:pStyle w:val="Compact"/>
-            </w:pPr>
-          </w:p>
-        </w:tc>
-        <w:tc>
-          <w:tcPr/>
-          <w:p>
-            <w:pPr>
-              <w:pStyle w:val="Compact"/>
-            </w:pPr>
-          </w:p>
-        </w:tc>
-        <w:tc>
-          <w:tcPr/>
-          <w:p>
-            <w:pPr>
-              <w:pStyle w:val="Compact"/>
-            </w:pPr>
-            <w:r>
-              <w:t xml:space="preserve">☐</w:t>
-            </w:r>
-          </w:p>
-        </w:tc>
-      </w:tr>
-      <w:tr>
-        <w:tc>
-          <w:tcPr/>
-          <w:p>
-            <w:pPr>
-              <w:pStyle w:val="Compact"/>
-            </w:pPr>
-            <w:r>
-              <w:t xml:space="preserve">Center for Victim Studies</w:t>
-            </w:r>
-          </w:p>
-        </w:tc>
-        <w:tc>
-          <w:tcPr/>
-          <w:p>
-            <w:pPr>
-              <w:pStyle w:val="Compact"/>
-            </w:pPr>
-          </w:p>
-        </w:tc>
-        <w:tc>
-          <w:tcPr/>
-          <w:p>
-            <w:pPr>
-              <w:pStyle w:val="Compact"/>
-            </w:pPr>
-          </w:p>
-        </w:tc>
-        <w:tc>
-          <w:tcPr/>
-          <w:p>
-            <w:pPr>
-              <w:pStyle w:val="Compact"/>
-            </w:pPr>
-            <w:r>
-              <w:t xml:space="preserve">☐</w:t>
-            </w:r>
-          </w:p>
-        </w:tc>
-      </w:tr>
-      <w:tr>
-        <w:tc>
-          <w:tcPr/>
-          <w:p>
-            <w:pPr>
-              <w:pStyle w:val="Compact"/>
-            </w:pPr>
-            <w:r>
-              <w:t xml:space="preserve">Center for Violence Prevention and Intervention Research</w:t>
-            </w:r>
-          </w:p>
-        </w:tc>
-        <w:tc>
-          <w:tcPr/>
-          <w:p>
-            <w:pPr>
-              <w:pStyle w:val="Compact"/>
-            </w:pPr>
-          </w:p>
-        </w:tc>
-        <w:tc>
-          <w:tcPr/>
-          <w:p>
-            <w:pPr>
-              <w:pStyle w:val="Compact"/>
-            </w:pPr>
-          </w:p>
-        </w:tc>
-        <w:tc>
-          <w:tcPr/>
-          <w:p>
-            <w:pPr>
-              <w:pStyle w:val="Compact"/>
-            </w:pPr>
-            <w:r>
-              <w:t xml:space="preserve">☐</w:t>
-            </w:r>
-          </w:p>
-        </w:tc>
-      </w:tr>
-    </w:tbl>
-    <w:bookmarkEnd w:id="13"/>
-    <w:bookmarkStart w:id="14" w:name="X979ffe7352d1757b34e29497d0206e4d0b82724"/>
-    <w:p>
-      <w:pPr>
-        <w:pStyle w:val="Heading3"/>
-      </w:pPr>
-      <w:r>
-        <w:t xml:space="preserve">2b. Dataset thumbnails (5) —</w:t>
-      </w:r>
-      <w:r>
-        <w:t xml:space="preserve"> </w:t>
-      </w:r>
-      <w:r>
-        <w:rPr>
-          <w:i/>
-          <w:iCs/>
-        </w:rPr>
-        <w:t xml:space="preserve">setup: image field on Dataset</w:t>
-      </w:r>
-    </w:p>
-    <w:p>
-      <w:pPr>
-        <w:pStyle w:val="FirstParagraph"/>
-      </w:pPr>
-      <w:r>
-        <w:t xml:space="preserve">A small preview image per dataset.</w:t>
-      </w:r>
-    </w:p>
-    <w:tbl>
-      <w:tblPr>
-        <w:tblStyle w:val="Table"/>
-        <w:tblW w:type="auto" w:w="0"/>
-        <w:tblLook w:firstRow="1" w:lastRow="0" w:firstColumn="0" w:lastColumn="0" w:noHBand="0" w:noVBand="0" w:val="0020"/>
-      </w:tblPr>
-      <w:tblGrid>
-        <w:gridCol w:w="1980"/>
-        <w:gridCol w:w="1980"/>
-        <w:gridCol w:w="1980"/>
-        <w:gridCol w:w="1980"/>
-      </w:tblGrid>
-      <w:tr>
-        <w:trPr>
-          <w:tblHeader w:val="on"/>
-        </w:trPr>
-        <w:tc>
-          <w:tcPr/>
-          <w:p>
-            <w:pPr>
-              <w:pStyle w:val="Compact"/>
-            </w:pPr>
-            <w:r>
-              <w:t xml:space="preserve">Dataset</w:t>
-            </w:r>
-          </w:p>
-        </w:tc>
-        <w:tc>
-          <w:tcPr/>
-          <w:p>
-            <w:pPr>
-              <w:pStyle w:val="Compact"/>
-            </w:pPr>
-            <w:r>
-              <w:t xml:space="preserve">Owner</w:t>
-            </w:r>
-          </w:p>
-        </w:tc>
-        <w:tc>
-          <w:tcPr/>
-          <w:p>
-            <w:pPr>
-              <w:pStyle w:val="Compact"/>
-            </w:pPr>
-            <w:r>
-              <w:t xml:space="preserve">Target</w:t>
-            </w:r>
-          </w:p>
-        </w:tc>
-        <w:tc>
-          <w:tcPr/>
-          <w:p>
-            <w:pPr>
-              <w:pStyle w:val="Compact"/>
-            </w:pPr>
-            <w:r>
-              <w:t xml:space="preserve">Done</w:t>
-            </w:r>
-          </w:p>
-        </w:tc>
-      </w:tr>
-      <w:tr>
-        <w:tc>
-          <w:tcPr/>
-          <w:p>
-            <w:pPr>
-              <w:pStyle w:val="Compact"/>
-            </w:pPr>
-            <w:r>
-              <w:t xml:space="preserve">Death in Custody Reports</w:t>
-            </w:r>
-          </w:p>
-        </w:tc>
-        <w:tc>
-          <w:tcPr/>
-          <w:p>
-            <w:pPr>
-              <w:pStyle w:val="Compact"/>
-            </w:pPr>
-          </w:p>
-        </w:tc>
-        <w:tc>
-          <w:tcPr/>
-          <w:p>
-            <w:pPr>
-              <w:pStyle w:val="Compact"/>
-            </w:pPr>
-          </w:p>
-        </w:tc>
-        <w:tc>
-          <w:tcPr/>
-          <w:p>
-            <w:pPr>
-              <w:pStyle w:val="Compact"/>
-            </w:pPr>
-            <w:r>
-              <w:t xml:space="preserve">☐</w:t>
-            </w:r>
-          </w:p>
-        </w:tc>
-      </w:tr>
-      <w:tr>
-        <w:tc>
-          <w:tcPr/>
-          <w:p>
-            <w:pPr>
-              <w:pStyle w:val="Compact"/>
-            </w:pPr>
-            <w:r>
-              <w:t xml:space="preserve">Illinois Juvenile Justice Data Dashboard</w:t>
-            </w:r>
-          </w:p>
-        </w:tc>
-        <w:tc>
-          <w:tcPr/>
-          <w:p>
-            <w:pPr>
-              <w:pStyle w:val="Compact"/>
-            </w:pPr>
-          </w:p>
-        </w:tc>
-        <w:tc>
-          <w:tcPr/>
-          <w:p>
-            <w:pPr>
-              <w:pStyle w:val="Compact"/>
-            </w:pPr>
-          </w:p>
-        </w:tc>
-        <w:tc>
-          <w:tcPr/>
-          <w:p>
-            <w:pPr>
-              <w:pStyle w:val="Compact"/>
-            </w:pPr>
-            <w:r>
-              <w:t xml:space="preserve">☐</w:t>
-            </w:r>
-          </w:p>
-        </w:tc>
-      </w:tr>
-      <w:tr>
-        <w:tc>
-          <w:tcPr/>
-          <w:p>
-            <w:pPr>
-              <w:pStyle w:val="Compact"/>
-            </w:pPr>
-            <w:r>
-              <w:t xml:space="preserve">Illinois Uniform Crime Reports (UCR) Index Crime Offense</w:t>
-            </w:r>
-          </w:p>
-        </w:tc>
-        <w:tc>
-          <w:tcPr/>
-          <w:p>
-            <w:pPr>
-              <w:pStyle w:val="Compact"/>
-            </w:pPr>
-          </w:p>
-        </w:tc>
-        <w:tc>
-          <w:tcPr/>
-          <w:p>
-            <w:pPr>
-              <w:pStyle w:val="Compact"/>
-            </w:pPr>
-          </w:p>
-        </w:tc>
-        <w:tc>
-          <w:tcPr/>
-          <w:p>
-            <w:pPr>
-              <w:pStyle w:val="Compact"/>
-            </w:pPr>
-            <w:r>
-              <w:t xml:space="preserve">☐</w:t>
-            </w:r>
-          </w:p>
-        </w:tc>
-      </w:tr>
-      <w:tr>
-        <w:tc>
-          <w:tcPr/>
-          <w:p>
-            <w:pPr>
-              <w:pStyle w:val="Compact"/>
-            </w:pPr>
-            <w:r>
-              <w:t xml:space="preserve">Illinois Uniform Crime Reports (UCR) Index Crime Arrest</w:t>
-            </w:r>
-          </w:p>
-        </w:tc>
-        <w:tc>
-          <w:tcPr/>
-          <w:p>
-            <w:pPr>
-              <w:pStyle w:val="Compact"/>
-            </w:pPr>
-          </w:p>
-        </w:tc>
-        <w:tc>
-          <w:tcPr/>
-          <w:p>
-            <w:pPr>
-              <w:pStyle w:val="Compact"/>
-            </w:pPr>
-          </w:p>
-        </w:tc>
-        <w:tc>
-          <w:tcPr/>
-          <w:p>
-            <w:pPr>
-              <w:pStyle w:val="Compact"/>
-            </w:pPr>
-            <w:r>
-              <w:t xml:space="preserve">☐</w:t>
-            </w:r>
-          </w:p>
-        </w:tc>
-      </w:tr>
-      <w:tr>
-        <w:tc>
-          <w:tcPr/>
-          <w:p>
-            <w:pPr>
-              <w:pStyle w:val="Compact"/>
-            </w:pPr>
-            <w:r>
-              <w:t xml:space="preserve">Illinois Uniform Crime Reports (UCR) Hate Crime Offense</w:t>
-            </w:r>
-          </w:p>
-        </w:tc>
-        <w:tc>
-          <w:tcPr/>
-          <w:p>
-            <w:pPr>
-              <w:pStyle w:val="Compact"/>
-            </w:pPr>
-          </w:p>
-        </w:tc>
-        <w:tc>
-          <w:tcPr/>
-          <w:p>
-            <w:pPr>
-              <w:pStyle w:val="Compact"/>
-            </w:pPr>
-          </w:p>
-        </w:tc>
-        <w:tc>
-          <w:tcPr/>
-          <w:p>
-            <w:pPr>
-              <w:pStyle w:val="Compact"/>
-            </w:pPr>
-            <w:r>
-              <w:t xml:space="preserve">☐</w:t>
-            </w:r>
-          </w:p>
-        </w:tc>
-      </w:tr>
-    </w:tbl>
-    <w:bookmarkEnd w:id="14"/>
-    <w:bookmarkStart w:id="15" w:name="X55b4af7cb619b3d1bee8a144cf9867b46a172e6"/>
-    <w:p>
-      <w:pPr>
-        <w:pStyle w:val="Heading3"/>
-      </w:pPr>
-      <w:r>
-        <w:t xml:space="preserve">2c.</w:t>
-      </w:r>
-      <w:r>
-        <w:t xml:space="preserve"> </w:t>
-      </w:r>
-      <w:r>
-        <w:t xml:space="preserve">“Filter articles by center”</w:t>
-      </w:r>
-      <w:r>
-        <w:t xml:space="preserve"> </w:t>
-      </w:r>
-      <w:r>
-        <w:t xml:space="preserve">—</w:t>
-      </w:r>
-      <w:r>
-        <w:t xml:space="preserve"> </w:t>
-      </w:r>
-      <w:r>
-        <w:rPr>
-          <w:i/>
-          <w:iCs/>
-        </w:rPr>
-        <w:t xml:space="preserve">setup: Center ↔ Article link</w:t>
-      </w:r>
-    </w:p>
-    <w:p>
-      <w:pPr>
-        <w:pStyle w:val="FirstParagraph"/>
-      </w:pPr>
-      <w:r>
-        <w:t xml:space="preserve">Turns on the design’s</w:t>
-      </w:r>
-      <w:r>
-        <w:t xml:space="preserve"> </w:t>
-      </w:r>
-      <w:r>
-        <w:t xml:space="preserve">“All Centers”</w:t>
-      </w:r>
-      <w:r>
-        <w:t xml:space="preserve"> </w:t>
-      </w:r>
-      <w:r>
-        <w:t xml:space="preserve">filter on the Articles page. Once the link exists, each published</w:t>
-      </w:r>
-      <w:r>
-        <w:t xml:space="preserve"> </w:t>
-      </w:r>
-      <w:r>
-        <w:t xml:space="preserve">article is tagged with its center. This is a bulk editorial pass (~236 published articles) and can be</w:t>
-      </w:r>
-      <w:r>
-        <w:t xml:space="preserve"> </w:t>
-      </w:r>
-      <w:r>
-        <w:t xml:space="preserve">split among editors.</w:t>
-      </w:r>
-    </w:p>
-    <w:tbl>
-      <w:tblPr>
-        <w:tblStyle w:val="Table"/>
-        <w:tblW w:type="auto" w:w="0"/>
-        <w:tblLook w:firstRow="1" w:lastRow="0" w:firstColumn="0" w:lastColumn="0" w:noHBand="0" w:noVBand="0" w:val="0020"/>
-      </w:tblPr>
-      <w:tblGrid>
-        <w:gridCol w:w="1980"/>
-        <w:gridCol w:w="1980"/>
-        <w:gridCol w:w="1980"/>
-        <w:gridCol w:w="1980"/>
-      </w:tblGrid>
-      <w:tr>
-        <w:trPr>
-          <w:tblHeader w:val="on"/>
-        </w:trPr>
-        <w:tc>
-          <w:tcPr/>
-          <w:p>
-            <w:pPr>
-              <w:pStyle w:val="Compact"/>
-            </w:pPr>
-            <w:r>
-              <w:t xml:space="preserve">Task</w:t>
-            </w:r>
-          </w:p>
-        </w:tc>
-        <w:tc>
-          <w:tcPr/>
-          <w:p>
-            <w:pPr>
-              <w:pStyle w:val="Compact"/>
-            </w:pPr>
-            <w:r>
-              <w:t xml:space="preserve">Owner</w:t>
-            </w:r>
-          </w:p>
-        </w:tc>
-        <w:tc>
-          <w:tcPr/>
-          <w:p>
-            <w:pPr>
-              <w:pStyle w:val="Compact"/>
-            </w:pPr>
-            <w:r>
-              <w:t xml:space="preserve">Target</w:t>
-            </w:r>
-          </w:p>
-        </w:tc>
-        <w:tc>
-          <w:tcPr/>
-          <w:p>
-            <w:pPr>
-              <w:pStyle w:val="Compact"/>
-            </w:pPr>
-            <w:r>
-              <w:t xml:space="preserve">Done</w:t>
-            </w:r>
-          </w:p>
-        </w:tc>
-      </w:tr>
-      <w:tr>
-        <w:tc>
-          <w:tcPr/>
-          <w:p>
-            <w:pPr>
-              <w:pStyle w:val="Compact"/>
-            </w:pPr>
-            <w:r>
-              <w:t xml:space="preserve">Tag published articles with their center (~236 articles)</w:t>
-            </w:r>
-          </w:p>
-        </w:tc>
-        <w:tc>
-          <w:tcPr/>
-          <w:p>
-            <w:pPr>
-              <w:pStyle w:val="Compact"/>
-            </w:pPr>
-          </w:p>
-        </w:tc>
-        <w:tc>
-          <w:tcPr/>
-          <w:p>
-            <w:pPr>
-              <w:pStyle w:val="Compact"/>
-            </w:pPr>
-          </w:p>
-        </w:tc>
-        <w:tc>
-          <w:tcPr/>
-          <w:p>
-            <w:pPr>
-              <w:pStyle w:val="Compact"/>
-            </w:pPr>
-            <w:r>
-              <w:t xml:space="preserve">☐</w:t>
-            </w:r>
-          </w:p>
-        </w:tc>
-      </w:tr>
-    </w:tbl>
-    <w:bookmarkEnd w:id="15"/>
-    <w:bookmarkStart w:id="16" w:name="X6e166ffeaf52e3455879c96929f4d4254735da2"/>
-    <w:p>
-      <w:pPr>
-        <w:pStyle w:val="Heading3"/>
-      </w:pPr>
-      <w:r>
-        <w:t xml:space="preserve">2d. Related Publications &amp; Resources on project pages (5) —</w:t>
-      </w:r>
-      <w:r>
-        <w:t xml:space="preserve"> </w:t>
-      </w:r>
-      <w:r>
-        <w:rPr>
-          <w:i/>
-          <w:iCs/>
-        </w:rPr>
-        <w:t xml:space="preserve">setup: relations/fields on Project</w:t>
-      </w:r>
-    </w:p>
-    <w:p>
-      <w:pPr>
-        <w:pStyle w:val="FirstParagraph"/>
-      </w:pPr>
-      <w:r>
-        <w:t xml:space="preserve">Link each project to its related publications and downloadable resources.</w:t>
-      </w:r>
-    </w:p>
-    <w:tbl>
-      <w:tblPr>
-        <w:tblStyle w:val="Table"/>
-        <w:tblW w:type="auto" w:w="0"/>
-        <w:tblLook w:firstRow="1" w:lastRow="0" w:firstColumn="0" w:lastColumn="0" w:noHBand="0" w:noVBand="0" w:val="0020"/>
-      </w:tblPr>
-      <w:tblGrid>
-        <w:gridCol w:w="1980"/>
-        <w:gridCol w:w="1980"/>
-        <w:gridCol w:w="1980"/>
-        <w:gridCol w:w="1980"/>
-      </w:tblGrid>
-      <w:tr>
-        <w:trPr>
-          <w:tblHeader w:val="on"/>
-        </w:trPr>
-        <w:tc>
-          <w:tcPr/>
-          <w:p>
-            <w:pPr>
-              <w:pStyle w:val="Compact"/>
-            </w:pPr>
-            <w:r>
-              <w:t xml:space="preserve">Project</w:t>
-            </w:r>
-          </w:p>
-        </w:tc>
-        <w:tc>
-          <w:tcPr/>
-          <w:p>
-            <w:pPr>
-              <w:pStyle w:val="Compact"/>
-            </w:pPr>
-            <w:r>
-              <w:t xml:space="preserve">Owner</w:t>
-            </w:r>
-          </w:p>
-        </w:tc>
-        <w:tc>
-          <w:tcPr/>
-          <w:p>
-            <w:pPr>
-              <w:pStyle w:val="Compact"/>
-            </w:pPr>
-            <w:r>
-              <w:t xml:space="preserve">Target</w:t>
-            </w:r>
-          </w:p>
-        </w:tc>
-        <w:tc>
-          <w:tcPr/>
-          <w:p>
-            <w:pPr>
-              <w:pStyle w:val="Compact"/>
-            </w:pPr>
-            <w:r>
-              <w:t xml:space="preserve">Done</w:t>
-            </w:r>
-          </w:p>
-        </w:tc>
-      </w:tr>
-      <w:tr>
-        <w:tc>
-          <w:tcPr/>
-          <w:p>
-            <w:pPr>
-              <w:pStyle w:val="Compact"/>
-            </w:pPr>
-            <w:r>
-              <w:t xml:space="preserve">Justice Counts Implementation Program</w:t>
-            </w:r>
-          </w:p>
-        </w:tc>
-        <w:tc>
-          <w:tcPr/>
-          <w:p>
-            <w:pPr>
-              <w:pStyle w:val="Compact"/>
-            </w:pPr>
-          </w:p>
-        </w:tc>
-        <w:tc>
-          <w:tcPr/>
-          <w:p>
-            <w:pPr>
-              <w:pStyle w:val="Compact"/>
-            </w:pPr>
-          </w:p>
-        </w:tc>
-        <w:tc>
-          <w:tcPr/>
-          <w:p>
-            <w:pPr>
-              <w:pStyle w:val="Compact"/>
-            </w:pPr>
-            <w:r>
-              <w:t xml:space="preserve">☐</w:t>
-            </w:r>
-          </w:p>
-        </w:tc>
-      </w:tr>
-      <w:tr>
-        <w:tc>
-          <w:tcPr/>
-          <w:p>
-            <w:pPr>
-              <w:pStyle w:val="Compact"/>
-            </w:pPr>
-            <w:r>
-              <w:t xml:space="preserve">Restore, Reinvest, Renew (R3)</w:t>
-            </w:r>
-          </w:p>
-        </w:tc>
-        <w:tc>
-          <w:tcPr/>
-          <w:p>
-            <w:pPr>
-              <w:pStyle w:val="Compact"/>
-            </w:pPr>
-          </w:p>
-        </w:tc>
-        <w:tc>
-          <w:tcPr/>
-          <w:p>
-            <w:pPr>
-              <w:pStyle w:val="Compact"/>
-            </w:pPr>
-          </w:p>
-        </w:tc>
-        <w:tc>
-          <w:tcPr/>
-          <w:p>
-            <w:pPr>
-              <w:pStyle w:val="Compact"/>
-            </w:pPr>
-            <w:r>
-              <w:t xml:space="preserve">☐</w:t>
-            </w:r>
-          </w:p>
-        </w:tc>
-      </w:tr>
-      <w:tr>
-        <w:tc>
-          <w:tcPr/>
-          <w:p>
-            <w:pPr>
-              <w:pStyle w:val="Compact"/>
-            </w:pPr>
-            <w:r>
-              <w:t xml:space="preserve">Deaths in Custody</w:t>
-            </w:r>
-          </w:p>
-        </w:tc>
-        <w:tc>
-          <w:tcPr/>
-          <w:p>
-            <w:pPr>
-              <w:pStyle w:val="Compact"/>
-            </w:pPr>
-          </w:p>
-        </w:tc>
-        <w:tc>
-          <w:tcPr/>
-          <w:p>
-            <w:pPr>
-              <w:pStyle w:val="Compact"/>
-            </w:pPr>
-          </w:p>
-        </w:tc>
-        <w:tc>
-          <w:tcPr/>
-          <w:p>
-            <w:pPr>
-              <w:pStyle w:val="Compact"/>
-            </w:pPr>
-            <w:r>
-              <w:t xml:space="preserve">☐</w:t>
-            </w:r>
-          </w:p>
-        </w:tc>
-      </w:tr>
-      <w:tr>
-        <w:tc>
-          <w:tcPr/>
-          <w:p>
-            <w:pPr>
-              <w:pStyle w:val="Compact"/>
-            </w:pPr>
-            <w:r>
-              <w:t xml:space="preserve">Illinois Uniform Crime Report</w:t>
-            </w:r>
-          </w:p>
-        </w:tc>
-        <w:tc>
-          <w:tcPr/>
-          <w:p>
-            <w:pPr>
-              <w:pStyle w:val="Compact"/>
-            </w:pPr>
-          </w:p>
-        </w:tc>
-        <w:tc>
-          <w:tcPr/>
-          <w:p>
-            <w:pPr>
-              <w:pStyle w:val="Compact"/>
-            </w:pPr>
-          </w:p>
-        </w:tc>
-        <w:tc>
-          <w:tcPr/>
-          <w:p>
-            <w:pPr>
-              <w:pStyle w:val="Compact"/>
-            </w:pPr>
-            <w:r>
-              <w:t xml:space="preserve">☐</w:t>
-            </w:r>
-          </w:p>
-        </w:tc>
-      </w:tr>
-      <w:tr>
-        <w:tc>
-          <w:tcPr/>
-          <w:p>
-            <w:pPr>
-              <w:pStyle w:val="Compact"/>
-            </w:pPr>
-            <w:r>
-              <w:t xml:space="preserve">Violence Prevention Research</w:t>
-            </w:r>
-          </w:p>
-        </w:tc>
-        <w:tc>
-          <w:tcPr/>
-          <w:p>
-            <w:pPr>
-              <w:pStyle w:val="Compact"/>
-            </w:pPr>
-          </w:p>
-        </w:tc>
-        <w:tc>
-          <w:tcPr/>
-          <w:p>
-            <w:pPr>
-              <w:pStyle w:val="Compact"/>
-            </w:pPr>
-          </w:p>
-        </w:tc>
-        <w:tc>
-          <w:tcPr/>
-          <w:p>
-            <w:pPr>
-              <w:pStyle w:val="Compact"/>
-            </w:pPr>
-            <w:r>
-              <w:t xml:space="preserve">☐</w:t>
-            </w:r>
-          </w:p>
-        </w:tc>
-      </w:tr>
-    </w:tbl>
-    <w:bookmarkEnd w:id="16"/>
-    <w:bookmarkStart w:id="17" w:name="Xf7831d0a9e27798bbda4cea16e8635f146a05bc"/>
-    <w:p>
-      <w:pPr>
-        <w:pStyle w:val="Heading3"/>
-      </w:pPr>
-      <w:r>
-        <w:t xml:space="preserve">2e. Article</w:t>
-      </w:r>
-      <w:r>
-        <w:t xml:space="preserve"> </w:t>
-      </w:r>
-      <w:r>
-        <w:t xml:space="preserve">“Related Content”</w:t>
-      </w:r>
-      <w:r>
-        <w:t xml:space="preserve"> </w:t>
-      </w:r>
-      <w:r>
-        <w:t xml:space="preserve">links —</w:t>
-      </w:r>
-      <w:r>
-        <w:t xml:space="preserve"> </w:t>
-      </w:r>
-      <w:r>
-        <w:rPr>
-          <w:i/>
-          <w:iCs/>
-        </w:rPr>
-        <w:t xml:space="preserve">setup: field on Article</w:t>
-      </w:r>
-    </w:p>
-    <w:p>
-      <w:pPr>
-        <w:pStyle w:val="FirstParagraph"/>
-      </w:pPr>
-      <w:r>
-        <w:t xml:space="preserve">An optional place to add hand-picked external links on an article. Populate where useful (related apps</w:t>
-      </w:r>
-      <w:r>
-        <w:t xml:space="preserve"> </w:t>
-      </w:r>
-      <w:r>
-        <w:t xml:space="preserve">and datasets already appear automatically when they are linked).</w:t>
-      </w:r>
-    </w:p>
-    <w:tbl>
-      <w:tblPr>
-        <w:tblStyle w:val="Table"/>
-        <w:tblW w:type="auto" w:w="0"/>
-        <w:tblLook w:firstRow="1" w:lastRow="0" w:firstColumn="0" w:lastColumn="0" w:noHBand="0" w:noVBand="0" w:val="0020"/>
-      </w:tblPr>
-      <w:tblGrid>
-        <w:gridCol w:w="1980"/>
-        <w:gridCol w:w="1980"/>
-        <w:gridCol w:w="1980"/>
-        <w:gridCol w:w="1980"/>
-      </w:tblGrid>
-      <w:tr>
-        <w:trPr>
-          <w:tblHeader w:val="on"/>
-        </w:trPr>
-        <w:tc>
-          <w:tcPr/>
-          <w:p>
-            <w:pPr>
-              <w:pStyle w:val="Compact"/>
-            </w:pPr>
-            <w:r>
-              <w:t xml:space="preserve">Task</w:t>
-            </w:r>
-          </w:p>
-        </w:tc>
-        <w:tc>
-          <w:tcPr/>
-          <w:p>
-            <w:pPr>
-              <w:pStyle w:val="Compact"/>
-            </w:pPr>
-            <w:r>
-              <w:t xml:space="preserve">Owner</w:t>
-            </w:r>
-          </w:p>
-        </w:tc>
-        <w:tc>
-          <w:tcPr/>
-          <w:p>
-            <w:pPr>
-              <w:pStyle w:val="Compact"/>
-            </w:pPr>
-            <w:r>
-              <w:t xml:space="preserve">Target</w:t>
-            </w:r>
-          </w:p>
-        </w:tc>
-        <w:tc>
-          <w:tcPr/>
-          <w:p>
-            <w:pPr>
-              <w:pStyle w:val="Compact"/>
-            </w:pPr>
-            <w:r>
-              <w:t xml:space="preserve">Done</w:t>
-            </w:r>
-          </w:p>
-        </w:tc>
-      </w:tr>
-      <w:tr>
-        <w:tc>
-          <w:tcPr/>
-          <w:p>
-            <w:pPr>
-              <w:pStyle w:val="Compact"/>
-            </w:pPr>
-            <w:r>
-              <w:t xml:space="preserve">Add</w:t>
-            </w:r>
-            <w:r>
-              <w:t xml:space="preserve"> </w:t>
-            </w:r>
-            <w:r>
-              <w:t xml:space="preserve">“Related Content”</w:t>
-            </w:r>
-            <w:r>
-              <w:t xml:space="preserve"> </w:t>
-            </w:r>
-            <w:r>
-              <w:t xml:space="preserve">links where useful (as needed)</w:t>
-            </w:r>
-          </w:p>
-        </w:tc>
-        <w:tc>
-          <w:tcPr/>
-          <w:p>
-            <w:pPr>
-              <w:pStyle w:val="Compact"/>
-            </w:pPr>
-          </w:p>
-        </w:tc>
-        <w:tc>
-          <w:tcPr/>
-          <w:p>
-            <w:pPr>
-              <w:pStyle w:val="Compact"/>
-            </w:pPr>
-          </w:p>
-        </w:tc>
-        <w:tc>
-          <w:tcPr/>
-          <w:p>
-            <w:pPr>
-              <w:pStyle w:val="Compact"/>
-            </w:pPr>
-            <w:r>
-              <w:t xml:space="preserve">☐</w:t>
-            </w:r>
-          </w:p>
-        </w:tc>
-      </w:tr>
-    </w:tbl>
-    <w:p>
-      <w:r>
-        <w:pict>
-          <v:rect style="width:0;height:1.5pt" o:hralign="center" o:hrstd="t" o:hr="t"/>
-        </w:pict>
-      </w:r>
-    </w:p>
-    <w:bookmarkEnd w:id="17"/>
-    <w:bookmarkEnd w:id="18"/>
-    <w:bookmarkStart w:id="19" w:name="Xec0b683237f0dc3faa3f5da44abd5a0443e9649"/>
-    <w:p>
-      <w:pPr>
-        <w:pStyle w:val="Heading2"/>
-      </w:pPr>
-      <w:r>
-        <w:t xml:space="preserve">3. At go-live — content sync</w:t>
       </w:r>
     </w:p>
     <w:tbl>
@@ -2183,7 +1020,7 @@
               <w:pStyle w:val="Compact"/>
             </w:pPr>
             <w:r>
-              <w:t xml:space="preserve">Task</w:t>
+              <w:t xml:space="preserve">Center</w:t>
             </w:r>
           </w:p>
         </w:tc>
@@ -2229,6 +1066,1290 @@
               <w:pStyle w:val="Compact"/>
             </w:pPr>
             <w:r>
+              <w:t xml:space="preserve">Center for Community Corrections Research</w:t>
+            </w:r>
+          </w:p>
+        </w:tc>
+        <w:tc>
+          <w:tcPr/>
+          <w:p>
+            <w:pPr>
+              <w:pStyle w:val="Compact"/>
+            </w:pPr>
+            <w:r>
+              <w:t xml:space="preserve">R&amp;A staff</w:t>
+            </w:r>
+          </w:p>
+        </w:tc>
+        <w:tc>
+          <w:tcPr/>
+          <w:p>
+            <w:pPr>
+              <w:pStyle w:val="Compact"/>
+            </w:pPr>
+          </w:p>
+        </w:tc>
+        <w:tc>
+          <w:tcPr/>
+          <w:p>
+            <w:pPr>
+              <w:pStyle w:val="Compact"/>
+            </w:pPr>
+            <w:r>
+              <w:t xml:space="preserve">☐</w:t>
+            </w:r>
+          </w:p>
+        </w:tc>
+      </w:tr>
+      <w:tr>
+        <w:tc>
+          <w:tcPr/>
+          <w:p>
+            <w:pPr>
+              <w:pStyle w:val="Compact"/>
+            </w:pPr>
+            <w:r>
+              <w:t xml:space="preserve">Center for Criminal Justice Data and Analytics</w:t>
+            </w:r>
+          </w:p>
+        </w:tc>
+        <w:tc>
+          <w:tcPr/>
+          <w:p>
+            <w:pPr>
+              <w:pStyle w:val="Compact"/>
+            </w:pPr>
+            <w:r>
+              <w:t xml:space="preserve">R&amp;A staff</w:t>
+            </w:r>
+          </w:p>
+        </w:tc>
+        <w:tc>
+          <w:tcPr/>
+          <w:p>
+            <w:pPr>
+              <w:pStyle w:val="Compact"/>
+            </w:pPr>
+          </w:p>
+        </w:tc>
+        <w:tc>
+          <w:tcPr/>
+          <w:p>
+            <w:pPr>
+              <w:pStyle w:val="Compact"/>
+            </w:pPr>
+            <w:r>
+              <w:t xml:space="preserve">☐</w:t>
+            </w:r>
+          </w:p>
+        </w:tc>
+      </w:tr>
+      <w:tr>
+        <w:tc>
+          <w:tcPr/>
+          <w:p>
+            <w:pPr>
+              <w:pStyle w:val="Compact"/>
+            </w:pPr>
+            <w:r>
+              <w:t xml:space="preserve">Center for Justice Research and Evaluation</w:t>
+            </w:r>
+          </w:p>
+        </w:tc>
+        <w:tc>
+          <w:tcPr/>
+          <w:p>
+            <w:pPr>
+              <w:pStyle w:val="Compact"/>
+            </w:pPr>
+            <w:r>
+              <w:t xml:space="preserve">R&amp;A staff</w:t>
+            </w:r>
+          </w:p>
+        </w:tc>
+        <w:tc>
+          <w:tcPr/>
+          <w:p>
+            <w:pPr>
+              <w:pStyle w:val="Compact"/>
+            </w:pPr>
+          </w:p>
+        </w:tc>
+        <w:tc>
+          <w:tcPr/>
+          <w:p>
+            <w:pPr>
+              <w:pStyle w:val="Compact"/>
+            </w:pPr>
+            <w:r>
+              <w:t xml:space="preserve">☐</w:t>
+            </w:r>
+          </w:p>
+        </w:tc>
+      </w:tr>
+      <w:tr>
+        <w:tc>
+          <w:tcPr/>
+          <w:p>
+            <w:pPr>
+              <w:pStyle w:val="Compact"/>
+            </w:pPr>
+            <w:r>
+              <w:t xml:space="preserve">Center for Sponsored Research &amp; Program Development</w:t>
+            </w:r>
+          </w:p>
+        </w:tc>
+        <w:tc>
+          <w:tcPr/>
+          <w:p>
+            <w:pPr>
+              <w:pStyle w:val="Compact"/>
+            </w:pPr>
+            <w:r>
+              <w:t xml:space="preserve">R&amp;A staff</w:t>
+            </w:r>
+          </w:p>
+        </w:tc>
+        <w:tc>
+          <w:tcPr/>
+          <w:p>
+            <w:pPr>
+              <w:pStyle w:val="Compact"/>
+            </w:pPr>
+          </w:p>
+        </w:tc>
+        <w:tc>
+          <w:tcPr/>
+          <w:p>
+            <w:pPr>
+              <w:pStyle w:val="Compact"/>
+            </w:pPr>
+            <w:r>
+              <w:t xml:space="preserve">☐</w:t>
+            </w:r>
+          </w:p>
+        </w:tc>
+      </w:tr>
+      <w:tr>
+        <w:tc>
+          <w:tcPr/>
+          <w:p>
+            <w:pPr>
+              <w:pStyle w:val="Compact"/>
+            </w:pPr>
+            <w:r>
+              <w:t xml:space="preserve">Center for Victim Studies</w:t>
+            </w:r>
+          </w:p>
+        </w:tc>
+        <w:tc>
+          <w:tcPr/>
+          <w:p>
+            <w:pPr>
+              <w:pStyle w:val="Compact"/>
+            </w:pPr>
+            <w:r>
+              <w:t xml:space="preserve">R&amp;A staff</w:t>
+            </w:r>
+          </w:p>
+        </w:tc>
+        <w:tc>
+          <w:tcPr/>
+          <w:p>
+            <w:pPr>
+              <w:pStyle w:val="Compact"/>
+            </w:pPr>
+          </w:p>
+        </w:tc>
+        <w:tc>
+          <w:tcPr/>
+          <w:p>
+            <w:pPr>
+              <w:pStyle w:val="Compact"/>
+            </w:pPr>
+            <w:r>
+              <w:t xml:space="preserve">☐</w:t>
+            </w:r>
+          </w:p>
+        </w:tc>
+      </w:tr>
+      <w:tr>
+        <w:tc>
+          <w:tcPr/>
+          <w:p>
+            <w:pPr>
+              <w:pStyle w:val="Compact"/>
+            </w:pPr>
+            <w:r>
+              <w:t xml:space="preserve">Center for Violence Prevention and Intervention Research</w:t>
+            </w:r>
+          </w:p>
+        </w:tc>
+        <w:tc>
+          <w:tcPr/>
+          <w:p>
+            <w:pPr>
+              <w:pStyle w:val="Compact"/>
+            </w:pPr>
+            <w:r>
+              <w:t xml:space="preserve">R&amp;A staff</w:t>
+            </w:r>
+          </w:p>
+        </w:tc>
+        <w:tc>
+          <w:tcPr/>
+          <w:p>
+            <w:pPr>
+              <w:pStyle w:val="Compact"/>
+            </w:pPr>
+          </w:p>
+        </w:tc>
+        <w:tc>
+          <w:tcPr/>
+          <w:p>
+            <w:pPr>
+              <w:pStyle w:val="Compact"/>
+            </w:pPr>
+            <w:r>
+              <w:t xml:space="preserve">☐</w:t>
+            </w:r>
+          </w:p>
+        </w:tc>
+      </w:tr>
+    </w:tbl>
+    <w:bookmarkEnd w:id="13"/>
+    <w:bookmarkStart w:id="14" w:name="X979ffe7352d1757b34e29497d0206e4d0b82724"/>
+    <w:p>
+      <w:pPr>
+        <w:pStyle w:val="Heading3"/>
+      </w:pPr>
+      <w:r>
+        <w:t xml:space="preserve">2b. Dataset thumbnails (5) —</w:t>
+      </w:r>
+      <w:r>
+        <w:t xml:space="preserve"> </w:t>
+      </w:r>
+      <w:r>
+        <w:rPr>
+          <w:i/>
+          <w:iCs/>
+        </w:rPr>
+        <w:t xml:space="preserve">setup: image field on Dataset</w:t>
+      </w:r>
+    </w:p>
+    <w:p>
+      <w:pPr>
+        <w:pStyle w:val="FirstParagraph"/>
+      </w:pPr>
+      <w:r>
+        <w:t xml:space="preserve">A small preview image per dataset.</w:t>
+      </w:r>
+    </w:p>
+    <w:tbl>
+      <w:tblPr>
+        <w:tblStyle w:val="Table"/>
+        <w:tblW w:type="pct" w:w="5000"/>
+        <w:tblLayout w:type="fixed"/>
+        <w:tblLook w:firstRow="1" w:lastRow="0" w:firstColumn="0" w:lastColumn="0" w:noHBand="0" w:noVBand="0" w:val="0020"/>
+      </w:tblPr>
+      <w:tblGrid>
+        <w:gridCol w:w="1980"/>
+        <w:gridCol w:w="1980"/>
+        <w:gridCol w:w="1980"/>
+        <w:gridCol w:w="1980"/>
+      </w:tblGrid>
+      <w:tr>
+        <w:trPr>
+          <w:tblHeader w:val="on"/>
+        </w:trPr>
+        <w:tc>
+          <w:tcPr/>
+          <w:p>
+            <w:pPr>
+              <w:pStyle w:val="Compact"/>
+            </w:pPr>
+            <w:r>
+              <w:t xml:space="preserve">Dataset</w:t>
+            </w:r>
+          </w:p>
+        </w:tc>
+        <w:tc>
+          <w:tcPr/>
+          <w:p>
+            <w:pPr>
+              <w:pStyle w:val="Compact"/>
+            </w:pPr>
+            <w:r>
+              <w:t xml:space="preserve">Owner</w:t>
+            </w:r>
+          </w:p>
+        </w:tc>
+        <w:tc>
+          <w:tcPr/>
+          <w:p>
+            <w:pPr>
+              <w:pStyle w:val="Compact"/>
+            </w:pPr>
+            <w:r>
+              <w:t xml:space="preserve">Target</w:t>
+            </w:r>
+          </w:p>
+        </w:tc>
+        <w:tc>
+          <w:tcPr/>
+          <w:p>
+            <w:pPr>
+              <w:pStyle w:val="Compact"/>
+            </w:pPr>
+            <w:r>
+              <w:t xml:space="preserve">Done</w:t>
+            </w:r>
+          </w:p>
+        </w:tc>
+      </w:tr>
+      <w:tr>
+        <w:tc>
+          <w:tcPr/>
+          <w:p>
+            <w:pPr>
+              <w:pStyle w:val="Compact"/>
+            </w:pPr>
+            <w:r>
+              <w:t xml:space="preserve">Death in Custody Reports</w:t>
+            </w:r>
+          </w:p>
+        </w:tc>
+        <w:tc>
+          <w:tcPr/>
+          <w:p>
+            <w:pPr>
+              <w:pStyle w:val="Compact"/>
+            </w:pPr>
+            <w:r>
+              <w:t xml:space="preserve">R&amp;A staff</w:t>
+            </w:r>
+          </w:p>
+        </w:tc>
+        <w:tc>
+          <w:tcPr/>
+          <w:p>
+            <w:pPr>
+              <w:pStyle w:val="Compact"/>
+            </w:pPr>
+          </w:p>
+        </w:tc>
+        <w:tc>
+          <w:tcPr/>
+          <w:p>
+            <w:pPr>
+              <w:pStyle w:val="Compact"/>
+            </w:pPr>
+            <w:r>
+              <w:t xml:space="preserve">☐</w:t>
+            </w:r>
+          </w:p>
+        </w:tc>
+      </w:tr>
+      <w:tr>
+        <w:tc>
+          <w:tcPr/>
+          <w:p>
+            <w:pPr>
+              <w:pStyle w:val="Compact"/>
+            </w:pPr>
+            <w:r>
+              <w:t xml:space="preserve">Illinois Juvenile Justice Data Dashboard</w:t>
+            </w:r>
+          </w:p>
+        </w:tc>
+        <w:tc>
+          <w:tcPr/>
+          <w:p>
+            <w:pPr>
+              <w:pStyle w:val="Compact"/>
+            </w:pPr>
+            <w:r>
+              <w:t xml:space="preserve">R&amp;A staff</w:t>
+            </w:r>
+          </w:p>
+        </w:tc>
+        <w:tc>
+          <w:tcPr/>
+          <w:p>
+            <w:pPr>
+              <w:pStyle w:val="Compact"/>
+            </w:pPr>
+          </w:p>
+        </w:tc>
+        <w:tc>
+          <w:tcPr/>
+          <w:p>
+            <w:pPr>
+              <w:pStyle w:val="Compact"/>
+            </w:pPr>
+            <w:r>
+              <w:t xml:space="preserve">☐</w:t>
+            </w:r>
+          </w:p>
+        </w:tc>
+      </w:tr>
+      <w:tr>
+        <w:tc>
+          <w:tcPr/>
+          <w:p>
+            <w:pPr>
+              <w:pStyle w:val="Compact"/>
+            </w:pPr>
+            <w:r>
+              <w:t xml:space="preserve">Illinois Uniform Crime Reports (UCR) Index Crime Offense</w:t>
+            </w:r>
+          </w:p>
+        </w:tc>
+        <w:tc>
+          <w:tcPr/>
+          <w:p>
+            <w:pPr>
+              <w:pStyle w:val="Compact"/>
+            </w:pPr>
+            <w:r>
+              <w:t xml:space="preserve">R&amp;A staff</w:t>
+            </w:r>
+          </w:p>
+        </w:tc>
+        <w:tc>
+          <w:tcPr/>
+          <w:p>
+            <w:pPr>
+              <w:pStyle w:val="Compact"/>
+            </w:pPr>
+          </w:p>
+        </w:tc>
+        <w:tc>
+          <w:tcPr/>
+          <w:p>
+            <w:pPr>
+              <w:pStyle w:val="Compact"/>
+            </w:pPr>
+            <w:r>
+              <w:t xml:space="preserve">☐</w:t>
+            </w:r>
+          </w:p>
+        </w:tc>
+      </w:tr>
+      <w:tr>
+        <w:tc>
+          <w:tcPr/>
+          <w:p>
+            <w:pPr>
+              <w:pStyle w:val="Compact"/>
+            </w:pPr>
+            <w:r>
+              <w:t xml:space="preserve">Illinois Uniform Crime Reports (UCR) Index Crime Arrest</w:t>
+            </w:r>
+          </w:p>
+        </w:tc>
+        <w:tc>
+          <w:tcPr/>
+          <w:p>
+            <w:pPr>
+              <w:pStyle w:val="Compact"/>
+            </w:pPr>
+            <w:r>
+              <w:t xml:space="preserve">R&amp;A staff</w:t>
+            </w:r>
+          </w:p>
+        </w:tc>
+        <w:tc>
+          <w:tcPr/>
+          <w:p>
+            <w:pPr>
+              <w:pStyle w:val="Compact"/>
+            </w:pPr>
+          </w:p>
+        </w:tc>
+        <w:tc>
+          <w:tcPr/>
+          <w:p>
+            <w:pPr>
+              <w:pStyle w:val="Compact"/>
+            </w:pPr>
+            <w:r>
+              <w:t xml:space="preserve">☐</w:t>
+            </w:r>
+          </w:p>
+        </w:tc>
+      </w:tr>
+      <w:tr>
+        <w:tc>
+          <w:tcPr/>
+          <w:p>
+            <w:pPr>
+              <w:pStyle w:val="Compact"/>
+            </w:pPr>
+            <w:r>
+              <w:t xml:space="preserve">Illinois Uniform Crime Reports (UCR) Hate Crime Offense</w:t>
+            </w:r>
+          </w:p>
+        </w:tc>
+        <w:tc>
+          <w:tcPr/>
+          <w:p>
+            <w:pPr>
+              <w:pStyle w:val="Compact"/>
+            </w:pPr>
+            <w:r>
+              <w:t xml:space="preserve">R&amp;A staff</w:t>
+            </w:r>
+          </w:p>
+        </w:tc>
+        <w:tc>
+          <w:tcPr/>
+          <w:p>
+            <w:pPr>
+              <w:pStyle w:val="Compact"/>
+            </w:pPr>
+          </w:p>
+        </w:tc>
+        <w:tc>
+          <w:tcPr/>
+          <w:p>
+            <w:pPr>
+              <w:pStyle w:val="Compact"/>
+            </w:pPr>
+            <w:r>
+              <w:t xml:space="preserve">☐</w:t>
+            </w:r>
+          </w:p>
+        </w:tc>
+      </w:tr>
+    </w:tbl>
+    <w:bookmarkEnd w:id="14"/>
+    <w:bookmarkStart w:id="15" w:name="X55b4af7cb619b3d1bee8a144cf9867b46a172e6"/>
+    <w:p>
+      <w:pPr>
+        <w:pStyle w:val="Heading3"/>
+      </w:pPr>
+      <w:r>
+        <w:t xml:space="preserve">2c.</w:t>
+      </w:r>
+      <w:r>
+        <w:t xml:space="preserve"> </w:t>
+      </w:r>
+      <w:r>
+        <w:t xml:space="preserve">“Filter articles by center”</w:t>
+      </w:r>
+      <w:r>
+        <w:t xml:space="preserve"> </w:t>
+      </w:r>
+      <w:r>
+        <w:t xml:space="preserve">—</w:t>
+      </w:r>
+      <w:r>
+        <w:t xml:space="preserve"> </w:t>
+      </w:r>
+      <w:r>
+        <w:rPr>
+          <w:i/>
+          <w:iCs/>
+        </w:rPr>
+        <w:t xml:space="preserve">setup: Center ↔ Article link</w:t>
+      </w:r>
+    </w:p>
+    <w:p>
+      <w:pPr>
+        <w:pStyle w:val="FirstParagraph"/>
+      </w:pPr>
+      <w:r>
+        <w:t xml:space="preserve">Turns on the design’s</w:t>
+      </w:r>
+      <w:r>
+        <w:t xml:space="preserve"> </w:t>
+      </w:r>
+      <w:r>
+        <w:t xml:space="preserve">“All Centers”</w:t>
+      </w:r>
+      <w:r>
+        <w:t xml:space="preserve"> </w:t>
+      </w:r>
+      <w:r>
+        <w:t xml:space="preserve">filter on the Articles page. Once the link exists, each published</w:t>
+      </w:r>
+      <w:r>
+        <w:t xml:space="preserve"> </w:t>
+      </w:r>
+      <w:r>
+        <w:t xml:space="preserve">article is tagged with its center. This is a bulk editorial pass (~236 published articles) and can be</w:t>
+      </w:r>
+      <w:r>
+        <w:t xml:space="preserve"> </w:t>
+      </w:r>
+      <w:r>
+        <w:t xml:space="preserve">split among editors.</w:t>
+      </w:r>
+    </w:p>
+    <w:tbl>
+      <w:tblPr>
+        <w:tblStyle w:val="Table"/>
+        <w:tblW w:type="pct" w:w="5000"/>
+        <w:tblLayout w:type="fixed"/>
+        <w:tblLook w:firstRow="1" w:lastRow="0" w:firstColumn="0" w:lastColumn="0" w:noHBand="0" w:noVBand="0" w:val="0020"/>
+      </w:tblPr>
+      <w:tblGrid>
+        <w:gridCol w:w="1980"/>
+        <w:gridCol w:w="1980"/>
+        <w:gridCol w:w="1980"/>
+        <w:gridCol w:w="1980"/>
+      </w:tblGrid>
+      <w:tr>
+        <w:trPr>
+          <w:tblHeader w:val="on"/>
+        </w:trPr>
+        <w:tc>
+          <w:tcPr/>
+          <w:p>
+            <w:pPr>
+              <w:pStyle w:val="Compact"/>
+            </w:pPr>
+            <w:r>
+              <w:t xml:space="preserve">Task</w:t>
+            </w:r>
+          </w:p>
+        </w:tc>
+        <w:tc>
+          <w:tcPr/>
+          <w:p>
+            <w:pPr>
+              <w:pStyle w:val="Compact"/>
+            </w:pPr>
+            <w:r>
+              <w:t xml:space="preserve">Owner</w:t>
+            </w:r>
+          </w:p>
+        </w:tc>
+        <w:tc>
+          <w:tcPr/>
+          <w:p>
+            <w:pPr>
+              <w:pStyle w:val="Compact"/>
+            </w:pPr>
+            <w:r>
+              <w:t xml:space="preserve">Target</w:t>
+            </w:r>
+          </w:p>
+        </w:tc>
+        <w:tc>
+          <w:tcPr/>
+          <w:p>
+            <w:pPr>
+              <w:pStyle w:val="Compact"/>
+            </w:pPr>
+            <w:r>
+              <w:t xml:space="preserve">Done</w:t>
+            </w:r>
+          </w:p>
+        </w:tc>
+      </w:tr>
+      <w:tr>
+        <w:tc>
+          <w:tcPr/>
+          <w:p>
+            <w:pPr>
+              <w:pStyle w:val="Compact"/>
+            </w:pPr>
+            <w:r>
+              <w:t xml:space="preserve">Tag published articles with their center (~236 articles)</w:t>
+            </w:r>
+          </w:p>
+        </w:tc>
+        <w:tc>
+          <w:tcPr/>
+          <w:p>
+            <w:pPr>
+              <w:pStyle w:val="Compact"/>
+            </w:pPr>
+            <w:r>
+              <w:t xml:space="preserve">R&amp;A staff</w:t>
+            </w:r>
+          </w:p>
+        </w:tc>
+        <w:tc>
+          <w:tcPr/>
+          <w:p>
+            <w:pPr>
+              <w:pStyle w:val="Compact"/>
+            </w:pPr>
+          </w:p>
+        </w:tc>
+        <w:tc>
+          <w:tcPr/>
+          <w:p>
+            <w:pPr>
+              <w:pStyle w:val="Compact"/>
+            </w:pPr>
+            <w:r>
+              <w:t xml:space="preserve">☐</w:t>
+            </w:r>
+          </w:p>
+        </w:tc>
+      </w:tr>
+    </w:tbl>
+    <w:bookmarkEnd w:id="15"/>
+    <w:bookmarkStart w:id="16" w:name="X6e166ffeaf52e3455879c96929f4d4254735da2"/>
+    <w:p>
+      <w:pPr>
+        <w:pStyle w:val="Heading3"/>
+      </w:pPr>
+      <w:r>
+        <w:t xml:space="preserve">2d. Related Publications &amp; Resources on project pages (5) —</w:t>
+      </w:r>
+      <w:r>
+        <w:t xml:space="preserve"> </w:t>
+      </w:r>
+      <w:r>
+        <w:rPr>
+          <w:i/>
+          <w:iCs/>
+        </w:rPr>
+        <w:t xml:space="preserve">setup: relations/fields on Project</w:t>
+      </w:r>
+    </w:p>
+    <w:p>
+      <w:pPr>
+        <w:pStyle w:val="FirstParagraph"/>
+      </w:pPr>
+      <w:r>
+        <w:t xml:space="preserve">Link each project to its related publications and downloadable resources.</w:t>
+      </w:r>
+    </w:p>
+    <w:tbl>
+      <w:tblPr>
+        <w:tblStyle w:val="Table"/>
+        <w:tblW w:type="auto" w:w="0"/>
+        <w:tblLook w:firstRow="1" w:lastRow="0" w:firstColumn="0" w:lastColumn="0" w:noHBand="0" w:noVBand="0" w:val="0020"/>
+      </w:tblPr>
+      <w:tblGrid>
+        <w:gridCol w:w="1980"/>
+        <w:gridCol w:w="1980"/>
+        <w:gridCol w:w="1980"/>
+        <w:gridCol w:w="1980"/>
+      </w:tblGrid>
+      <w:tr>
+        <w:trPr>
+          <w:tblHeader w:val="on"/>
+        </w:trPr>
+        <w:tc>
+          <w:tcPr/>
+          <w:p>
+            <w:pPr>
+              <w:pStyle w:val="Compact"/>
+            </w:pPr>
+            <w:r>
+              <w:t xml:space="preserve">Project</w:t>
+            </w:r>
+          </w:p>
+        </w:tc>
+        <w:tc>
+          <w:tcPr/>
+          <w:p>
+            <w:pPr>
+              <w:pStyle w:val="Compact"/>
+            </w:pPr>
+            <w:r>
+              <w:t xml:space="preserve">Owner</w:t>
+            </w:r>
+          </w:p>
+        </w:tc>
+        <w:tc>
+          <w:tcPr/>
+          <w:p>
+            <w:pPr>
+              <w:pStyle w:val="Compact"/>
+            </w:pPr>
+            <w:r>
+              <w:t xml:space="preserve">Target</w:t>
+            </w:r>
+          </w:p>
+        </w:tc>
+        <w:tc>
+          <w:tcPr/>
+          <w:p>
+            <w:pPr>
+              <w:pStyle w:val="Compact"/>
+            </w:pPr>
+            <w:r>
+              <w:t xml:space="preserve">Done</w:t>
+            </w:r>
+          </w:p>
+        </w:tc>
+      </w:tr>
+      <w:tr>
+        <w:tc>
+          <w:tcPr/>
+          <w:p>
+            <w:pPr>
+              <w:pStyle w:val="Compact"/>
+            </w:pPr>
+            <w:r>
+              <w:t xml:space="preserve">Justice Counts Implementation Program</w:t>
+            </w:r>
+          </w:p>
+        </w:tc>
+        <w:tc>
+          <w:tcPr/>
+          <w:p>
+            <w:pPr>
+              <w:pStyle w:val="Compact"/>
+            </w:pPr>
+            <w:r>
+              <w:t xml:space="preserve">R&amp;A staff</w:t>
+            </w:r>
+          </w:p>
+        </w:tc>
+        <w:tc>
+          <w:tcPr/>
+          <w:p>
+            <w:pPr>
+              <w:pStyle w:val="Compact"/>
+            </w:pPr>
+          </w:p>
+        </w:tc>
+        <w:tc>
+          <w:tcPr/>
+          <w:p>
+            <w:pPr>
+              <w:pStyle w:val="Compact"/>
+            </w:pPr>
+            <w:r>
+              <w:t xml:space="preserve">☐</w:t>
+            </w:r>
+          </w:p>
+        </w:tc>
+      </w:tr>
+      <w:tr>
+        <w:tc>
+          <w:tcPr/>
+          <w:p>
+            <w:pPr>
+              <w:pStyle w:val="Compact"/>
+            </w:pPr>
+            <w:r>
+              <w:t xml:space="preserve">Restore, Reinvest, Renew (R3)</w:t>
+            </w:r>
+          </w:p>
+        </w:tc>
+        <w:tc>
+          <w:tcPr/>
+          <w:p>
+            <w:pPr>
+              <w:pStyle w:val="Compact"/>
+            </w:pPr>
+            <w:r>
+              <w:t xml:space="preserve">R&amp;A staff</w:t>
+            </w:r>
+          </w:p>
+        </w:tc>
+        <w:tc>
+          <w:tcPr/>
+          <w:p>
+            <w:pPr>
+              <w:pStyle w:val="Compact"/>
+            </w:pPr>
+          </w:p>
+        </w:tc>
+        <w:tc>
+          <w:tcPr/>
+          <w:p>
+            <w:pPr>
+              <w:pStyle w:val="Compact"/>
+            </w:pPr>
+            <w:r>
+              <w:t xml:space="preserve">☐</w:t>
+            </w:r>
+          </w:p>
+        </w:tc>
+      </w:tr>
+      <w:tr>
+        <w:tc>
+          <w:tcPr/>
+          <w:p>
+            <w:pPr>
+              <w:pStyle w:val="Compact"/>
+            </w:pPr>
+            <w:r>
+              <w:t xml:space="preserve">Deaths in Custody</w:t>
+            </w:r>
+          </w:p>
+        </w:tc>
+        <w:tc>
+          <w:tcPr/>
+          <w:p>
+            <w:pPr>
+              <w:pStyle w:val="Compact"/>
+            </w:pPr>
+            <w:r>
+              <w:t xml:space="preserve">R&amp;A staff</w:t>
+            </w:r>
+          </w:p>
+        </w:tc>
+        <w:tc>
+          <w:tcPr/>
+          <w:p>
+            <w:pPr>
+              <w:pStyle w:val="Compact"/>
+            </w:pPr>
+          </w:p>
+        </w:tc>
+        <w:tc>
+          <w:tcPr/>
+          <w:p>
+            <w:pPr>
+              <w:pStyle w:val="Compact"/>
+            </w:pPr>
+            <w:r>
+              <w:t xml:space="preserve">☐</w:t>
+            </w:r>
+          </w:p>
+        </w:tc>
+      </w:tr>
+      <w:tr>
+        <w:tc>
+          <w:tcPr/>
+          <w:p>
+            <w:pPr>
+              <w:pStyle w:val="Compact"/>
+            </w:pPr>
+            <w:r>
+              <w:t xml:space="preserve">Illinois Uniform Crime Report</w:t>
+            </w:r>
+          </w:p>
+        </w:tc>
+        <w:tc>
+          <w:tcPr/>
+          <w:p>
+            <w:pPr>
+              <w:pStyle w:val="Compact"/>
+            </w:pPr>
+            <w:r>
+              <w:t xml:space="preserve">R&amp;A staff</w:t>
+            </w:r>
+          </w:p>
+        </w:tc>
+        <w:tc>
+          <w:tcPr/>
+          <w:p>
+            <w:pPr>
+              <w:pStyle w:val="Compact"/>
+            </w:pPr>
+          </w:p>
+        </w:tc>
+        <w:tc>
+          <w:tcPr/>
+          <w:p>
+            <w:pPr>
+              <w:pStyle w:val="Compact"/>
+            </w:pPr>
+            <w:r>
+              <w:t xml:space="preserve">☐</w:t>
+            </w:r>
+          </w:p>
+        </w:tc>
+      </w:tr>
+      <w:tr>
+        <w:tc>
+          <w:tcPr/>
+          <w:p>
+            <w:pPr>
+              <w:pStyle w:val="Compact"/>
+            </w:pPr>
+            <w:r>
+              <w:t xml:space="preserve">Violence Prevention Research</w:t>
+            </w:r>
+          </w:p>
+        </w:tc>
+        <w:tc>
+          <w:tcPr/>
+          <w:p>
+            <w:pPr>
+              <w:pStyle w:val="Compact"/>
+            </w:pPr>
+            <w:r>
+              <w:t xml:space="preserve">R&amp;A staff</w:t>
+            </w:r>
+          </w:p>
+        </w:tc>
+        <w:tc>
+          <w:tcPr/>
+          <w:p>
+            <w:pPr>
+              <w:pStyle w:val="Compact"/>
+            </w:pPr>
+          </w:p>
+        </w:tc>
+        <w:tc>
+          <w:tcPr/>
+          <w:p>
+            <w:pPr>
+              <w:pStyle w:val="Compact"/>
+            </w:pPr>
+            <w:r>
+              <w:t xml:space="preserve">☐</w:t>
+            </w:r>
+          </w:p>
+        </w:tc>
+      </w:tr>
+    </w:tbl>
+    <w:bookmarkEnd w:id="16"/>
+    <w:bookmarkStart w:id="17" w:name="Xf7831d0a9e27798bbda4cea16e8635f146a05bc"/>
+    <w:p>
+      <w:pPr>
+        <w:pStyle w:val="Heading3"/>
+      </w:pPr>
+      <w:r>
+        <w:t xml:space="preserve">2e. Article</w:t>
+      </w:r>
+      <w:r>
+        <w:t xml:space="preserve"> </w:t>
+      </w:r>
+      <w:r>
+        <w:t xml:space="preserve">“Related Content”</w:t>
+      </w:r>
+      <w:r>
+        <w:t xml:space="preserve"> </w:t>
+      </w:r>
+      <w:r>
+        <w:t xml:space="preserve">links —</w:t>
+      </w:r>
+      <w:r>
+        <w:t xml:space="preserve"> </w:t>
+      </w:r>
+      <w:r>
+        <w:rPr>
+          <w:i/>
+          <w:iCs/>
+        </w:rPr>
+        <w:t xml:space="preserve">setup: field on Article</w:t>
+      </w:r>
+    </w:p>
+    <w:p>
+      <w:pPr>
+        <w:pStyle w:val="FirstParagraph"/>
+      </w:pPr>
+      <w:r>
+        <w:t xml:space="preserve">An optional place to add hand-picked external links on an article. Populate where useful (related apps</w:t>
+      </w:r>
+      <w:r>
+        <w:t xml:space="preserve"> </w:t>
+      </w:r>
+      <w:r>
+        <w:t xml:space="preserve">and datasets already appear automatically when they are linked).</w:t>
+      </w:r>
+    </w:p>
+    <w:tbl>
+      <w:tblPr>
+        <w:tblStyle w:val="Table"/>
+        <w:tblW w:type="pct" w:w="5000"/>
+        <w:tblLayout w:type="fixed"/>
+        <w:tblLook w:firstRow="1" w:lastRow="0" w:firstColumn="0" w:lastColumn="0" w:noHBand="0" w:noVBand="0" w:val="0020"/>
+      </w:tblPr>
+      <w:tblGrid>
+        <w:gridCol w:w="1980"/>
+        <w:gridCol w:w="1980"/>
+        <w:gridCol w:w="1980"/>
+        <w:gridCol w:w="1980"/>
+      </w:tblGrid>
+      <w:tr>
+        <w:trPr>
+          <w:tblHeader w:val="on"/>
+        </w:trPr>
+        <w:tc>
+          <w:tcPr/>
+          <w:p>
+            <w:pPr>
+              <w:pStyle w:val="Compact"/>
+            </w:pPr>
+            <w:r>
+              <w:t xml:space="preserve">Task</w:t>
+            </w:r>
+          </w:p>
+        </w:tc>
+        <w:tc>
+          <w:tcPr/>
+          <w:p>
+            <w:pPr>
+              <w:pStyle w:val="Compact"/>
+            </w:pPr>
+            <w:r>
+              <w:t xml:space="preserve">Owner</w:t>
+            </w:r>
+          </w:p>
+        </w:tc>
+        <w:tc>
+          <w:tcPr/>
+          <w:p>
+            <w:pPr>
+              <w:pStyle w:val="Compact"/>
+            </w:pPr>
+            <w:r>
+              <w:t xml:space="preserve">Target</w:t>
+            </w:r>
+          </w:p>
+        </w:tc>
+        <w:tc>
+          <w:tcPr/>
+          <w:p>
+            <w:pPr>
+              <w:pStyle w:val="Compact"/>
+            </w:pPr>
+            <w:r>
+              <w:t xml:space="preserve">Done</w:t>
+            </w:r>
+          </w:p>
+        </w:tc>
+      </w:tr>
+      <w:tr>
+        <w:tc>
+          <w:tcPr/>
+          <w:p>
+            <w:pPr>
+              <w:pStyle w:val="Compact"/>
+            </w:pPr>
+            <w:r>
+              <w:t xml:space="preserve">Add</w:t>
+            </w:r>
+            <w:r>
+              <w:t xml:space="preserve"> </w:t>
+            </w:r>
+            <w:r>
+              <w:t xml:space="preserve">“Related Content”</w:t>
+            </w:r>
+            <w:r>
+              <w:t xml:space="preserve"> </w:t>
+            </w:r>
+            <w:r>
+              <w:t xml:space="preserve">links where useful (as needed)</w:t>
+            </w:r>
+          </w:p>
+        </w:tc>
+        <w:tc>
+          <w:tcPr/>
+          <w:p>
+            <w:pPr>
+              <w:pStyle w:val="Compact"/>
+            </w:pPr>
+            <w:r>
+              <w:t xml:space="preserve">R&amp;A staff</w:t>
+            </w:r>
+          </w:p>
+        </w:tc>
+        <w:tc>
+          <w:tcPr/>
+          <w:p>
+            <w:pPr>
+              <w:pStyle w:val="Compact"/>
+            </w:pPr>
+          </w:p>
+        </w:tc>
+        <w:tc>
+          <w:tcPr/>
+          <w:p>
+            <w:pPr>
+              <w:pStyle w:val="Compact"/>
+            </w:pPr>
+            <w:r>
+              <w:t xml:space="preserve">☐</w:t>
+            </w:r>
+          </w:p>
+        </w:tc>
+      </w:tr>
+    </w:tbl>
+    <w:p>
+      <w:r>
+        <w:pict>
+          <v:rect style="width:0;height:1.5pt" o:hralign="center" o:hrstd="t" o:hr="t"/>
+        </w:pict>
+      </w:r>
+    </w:p>
+    <w:bookmarkEnd w:id="17"/>
+    <w:bookmarkEnd w:id="18"/>
+    <w:bookmarkStart w:id="19" w:name="Xec0b683237f0dc3faa3f5da44abd5a0443e9649"/>
+    <w:p>
+      <w:pPr>
+        <w:pStyle w:val="Heading2"/>
+      </w:pPr>
+      <w:r>
+        <w:t xml:space="preserve">3. At go-live — content sync</w:t>
+      </w:r>
+    </w:p>
+    <w:tbl>
+      <w:tblPr>
+        <w:tblStyle w:val="Table"/>
+        <w:tblW w:type="pct" w:w="5000"/>
+        <w:tblLayout w:type="fixed"/>
+        <w:tblLook w:firstRow="1" w:lastRow="0" w:firstColumn="0" w:lastColumn="0" w:noHBand="0" w:noVBand="0" w:val="0020"/>
+      </w:tblPr>
+      <w:tblGrid>
+        <w:gridCol w:w="1980"/>
+        <w:gridCol w:w="1980"/>
+        <w:gridCol w:w="1980"/>
+        <w:gridCol w:w="1980"/>
+      </w:tblGrid>
+      <w:tr>
+        <w:trPr>
+          <w:tblHeader w:val="on"/>
+        </w:trPr>
+        <w:tc>
+          <w:tcPr/>
+          <w:p>
+            <w:pPr>
+              <w:pStyle w:val="Compact"/>
+            </w:pPr>
+            <w:r>
+              <w:t xml:space="preserve">Task</w:t>
+            </w:r>
+          </w:p>
+        </w:tc>
+        <w:tc>
+          <w:tcPr/>
+          <w:p>
+            <w:pPr>
+              <w:pStyle w:val="Compact"/>
+            </w:pPr>
+            <w:r>
+              <w:t xml:space="preserve">Owner</w:t>
+            </w:r>
+          </w:p>
+        </w:tc>
+        <w:tc>
+          <w:tcPr/>
+          <w:p>
+            <w:pPr>
+              <w:pStyle w:val="Compact"/>
+            </w:pPr>
+            <w:r>
+              <w:t xml:space="preserve">Target</w:t>
+            </w:r>
+          </w:p>
+        </w:tc>
+        <w:tc>
+          <w:tcPr/>
+          <w:p>
+            <w:pPr>
+              <w:pStyle w:val="Compact"/>
+            </w:pPr>
+            <w:r>
+              <w:t xml:space="preserve">Done</w:t>
+            </w:r>
+          </w:p>
+        </w:tc>
+      </w:tr>
+      <w:tr>
+        <w:tc>
+          <w:tcPr/>
+          <w:p>
+            <w:pPr>
+              <w:pStyle w:val="Compact"/>
+            </w:pPr>
+            <w:r>
               <w:t xml:space="preserve">Bring over any articles published on the live Hub since this draft was built</w:t>
             </w:r>
           </w:p>
@@ -2239,6 +2360,9 @@
             <w:pPr>
               <w:pStyle w:val="Compact"/>
             </w:pPr>
+            <w:r>
+              <w:t xml:space="preserve">R&amp;A staff</w:t>
+            </w:r>
           </w:p>
         </w:tc>
         <w:tc>
@@ -2393,7 +2517,7 @@
           <w:i/>
           <w:iCs/>
         </w:rPr>
-        <w:t xml:space="preserve">Owner and Target pre-filled, or the ~236-article tagging pass split into assignable batches? The</w:t>
+        <w:t xml:space="preserve">Target dates added, or the ~236-article tagging pass split into assignable batches? The</w:t>
       </w:r>
       <w:r>
         <w:rPr>

</xml_diff>